<commit_message>
latest tsconfig.json with NodeNext
{
  "compilerOptions": {
    "target": "ES2022",
    "module": "NodeNext",
    "moduleResolution": "NodeNext"
  }
}
</commit_message>
<xml_diff>
--- a/ReferenceMaterials/Cucumber Playwright Typescript project guide.docx
+++ b/ReferenceMaterials/Cucumber Playwright Typescript project guide.docx
@@ -36,7 +36,7 @@
     <w:p>
       <w:r>
         <w:pict w14:anchorId="35D11D75">
-          <v:rect id="_x0000_i1181" style="width:0;height:1.5pt" o:hralign="center" o:hrstd="t" o:hr="t" fillcolor="#a0a0a0" stroked="f"/>
+          <v:rect id="_x0000_i1025" style="width:0;height:1.5pt" o:hralign="center" o:hrstd="t" o:hr="t" fillcolor="#a0a0a0" stroked="f"/>
         </w:pict>
       </w:r>
     </w:p>
@@ -121,7 +121,7 @@
     <w:p>
       <w:r>
         <w:pict w14:anchorId="3263D5D7">
-          <v:rect id="_x0000_i1182" style="width:0;height:1.5pt" o:hralign="center" o:hrstd="t" o:hr="t" fillcolor="#a0a0a0" stroked="f"/>
+          <v:rect id="_x0000_i1026" style="width:0;height:1.5pt" o:hralign="center" o:hrstd="t" o:hr="t" fillcolor="#a0a0a0" stroked="f"/>
         </w:pict>
       </w:r>
     </w:p>
@@ -188,7 +188,7 @@
     <w:p>
       <w:r>
         <w:pict w14:anchorId="3B0F65C2">
-          <v:rect id="_x0000_i1183" style="width:0;height:1.5pt" o:hralign="center" o:hrstd="t" o:hr="t" fillcolor="#a0a0a0" stroked="f"/>
+          <v:rect id="_x0000_i1027" style="width:0;height:1.5pt" o:hralign="center" o:hrstd="t" o:hr="t" fillcolor="#a0a0a0" stroked="f"/>
         </w:pict>
       </w:r>
     </w:p>
@@ -271,7 +271,7 @@
       <w:r>
         <w:lastRenderedPageBreak/>
         <w:pict w14:anchorId="58BF9659">
-          <v:rect id="_x0000_i1184" style="width:0;height:1.5pt" o:hralign="center" o:hrstd="t" o:hr="t" fillcolor="#a0a0a0" stroked="f"/>
+          <v:rect id="_x0000_i1028" style="width:0;height:1.5pt" o:hralign="center" o:hrstd="t" o:hr="t" fillcolor="#a0a0a0" stroked="f"/>
         </w:pict>
       </w:r>
     </w:p>
@@ -384,7 +384,7 @@
     <w:p>
       <w:r>
         <w:pict w14:anchorId="48F7AA20">
-          <v:rect id="_x0000_i1185" style="width:0;height:1.5pt" o:hralign="center" o:hrstd="t" o:hr="t" fillcolor="#a0a0a0" stroked="f"/>
+          <v:rect id="_x0000_i1029" style="width:0;height:1.5pt" o:hralign="center" o:hrstd="t" o:hr="t" fillcolor="#a0a0a0" stroked="f"/>
         </w:pict>
       </w:r>
     </w:p>
@@ -765,7 +765,7 @@
     <w:p>
       <w:r>
         <w:pict w14:anchorId="604666A3">
-          <v:rect id="_x0000_i1186" style="width:0;height:1.5pt" o:hralign="center" o:hrstd="t" o:hr="t" fillcolor="#a0a0a0" stroked="f"/>
+          <v:rect id="_x0000_i1030" style="width:0;height:1.5pt" o:hralign="center" o:hrstd="t" o:hr="t" fillcolor="#a0a0a0" stroked="f"/>
         </w:pict>
       </w:r>
     </w:p>
@@ -794,9 +794,177 @@
       <w:proofErr w:type="spellEnd"/>
     </w:p>
     <w:p>
-      <w:r>
+      <w:pPr>
+        <w:rPr>
+          <w:b/>
+          <w:bCs/>
+        </w:rPr>
+      </w:pPr>
+    </w:p>
+    <w:p>
+      <w:pPr>
+        <w:rPr>
+          <w:b/>
+          <w:bCs/>
+        </w:rPr>
+      </w:pPr>
+      <w:r>
+        <w:rPr>
+          <w:b/>
+          <w:bCs/>
+        </w:rPr>
+        <w:t>Latest</w:t>
+      </w:r>
+    </w:p>
+    <w:p>
+      <w:pPr>
+        <w:rPr>
+          <w:b/>
+          <w:bCs/>
+        </w:rPr>
+      </w:pPr>
+      <w:r>
+        <w:rPr>
+          <w:b/>
+          <w:bCs/>
+        </w:rPr>
         <w:t>{</w:t>
       </w:r>
+      <w:r>
+        <w:rPr>
+          <w:b/>
+          <w:bCs/>
+        </w:rPr>
+        <w:br/>
+        <w:t>"</w:t>
+      </w:r>
+      <w:proofErr w:type="spellStart"/>
+      <w:r>
+        <w:rPr>
+          <w:b/>
+          <w:bCs/>
+        </w:rPr>
+        <w:t>compilerOptions</w:t>
+      </w:r>
+      <w:proofErr w:type="spellEnd"/>
+      <w:r>
+        <w:rPr>
+          <w:b/>
+          <w:bCs/>
+        </w:rPr>
+        <w:t>": {</w:t>
+      </w:r>
+      <w:r>
+        <w:rPr>
+          <w:b/>
+          <w:bCs/>
+        </w:rPr>
+        <w:br/>
+        <w:t>"target": "ES2022",</w:t>
+      </w:r>
+      <w:r>
+        <w:rPr>
+          <w:b/>
+          <w:bCs/>
+        </w:rPr>
+        <w:br/>
+        <w:t>"module": "</w:t>
+      </w:r>
+      <w:proofErr w:type="spellStart"/>
+      <w:r>
+        <w:rPr>
+          <w:b/>
+          <w:bCs/>
+        </w:rPr>
+        <w:t>NodeNext</w:t>
+      </w:r>
+      <w:proofErr w:type="spellEnd"/>
+      <w:r>
+        <w:rPr>
+          <w:b/>
+          <w:bCs/>
+        </w:rPr>
+        <w:t>",</w:t>
+      </w:r>
+      <w:r>
+        <w:rPr>
+          <w:b/>
+          <w:bCs/>
+        </w:rPr>
+        <w:br/>
+        <w:t>"</w:t>
+      </w:r>
+      <w:proofErr w:type="spellStart"/>
+      <w:r>
+        <w:rPr>
+          <w:b/>
+          <w:bCs/>
+        </w:rPr>
+        <w:t>moduleResolution</w:t>
+      </w:r>
+      <w:proofErr w:type="spellEnd"/>
+      <w:r>
+        <w:rPr>
+          <w:b/>
+          <w:bCs/>
+        </w:rPr>
+        <w:t>": "</w:t>
+      </w:r>
+      <w:proofErr w:type="spellStart"/>
+      <w:r>
+        <w:rPr>
+          <w:b/>
+          <w:bCs/>
+        </w:rPr>
+        <w:t>NodeNext</w:t>
+      </w:r>
+      <w:proofErr w:type="spellEnd"/>
+      <w:r>
+        <w:rPr>
+          <w:b/>
+          <w:bCs/>
+        </w:rPr>
+        <w:t>"</w:t>
+      </w:r>
+      <w:r>
+        <w:rPr>
+          <w:b/>
+          <w:bCs/>
+        </w:rPr>
+        <w:br/>
+        <w:t>}</w:t>
+      </w:r>
+      <w:r>
+        <w:rPr>
+          <w:b/>
+          <w:bCs/>
+        </w:rPr>
+        <w:br/>
+        <w:t>}</w:t>
+      </w:r>
+    </w:p>
+    <w:p>
+      <w:pPr>
+        <w:rPr>
+          <w:b/>
+          <w:bCs/>
+        </w:rPr>
+      </w:pPr>
+      <w:r>
+        <w:rPr>
+          <w:b/>
+          <w:bCs/>
+        </w:rPr>
+        <w:t>Deprecated:</w:t>
+      </w:r>
+    </w:p>
+    <w:p>
+      <w:r>
+        <w:t>/*</w:t>
+      </w:r>
+      <w:r>
+        <w:t>{</w:t>
+      </w:r>
     </w:p>
     <w:p>
       <w:r>
@@ -818,6 +986,7 @@
     </w:p>
     <w:p>
       <w:r>
+        <w:lastRenderedPageBreak/>
         <w:t xml:space="preserve">    "module": "</w:t>
       </w:r>
       <w:proofErr w:type="spellStart"/>
@@ -903,63 +1072,614 @@
     </w:p>
     <w:p>
       <w:r>
+        <w:t xml:space="preserve">    "</w:t>
+      </w:r>
+      <w:proofErr w:type="spellStart"/>
+      <w:r>
+        <w:t>outDir</w:t>
+      </w:r>
+      <w:proofErr w:type="spellEnd"/>
+      <w:r>
+        <w:t>": "./</w:t>
+      </w:r>
+      <w:proofErr w:type="spellStart"/>
+      <w:r>
+        <w:t>dist</w:t>
+      </w:r>
+      <w:proofErr w:type="spellEnd"/>
+      <w:r>
+        <w:t>"</w:t>
+      </w:r>
+    </w:p>
+    <w:p>
+      <w:r>
+        <w:t xml:space="preserve">  },</w:t>
+      </w:r>
+    </w:p>
+    <w:p>
+      <w:r>
+        <w:t xml:space="preserve">  "include": [</w:t>
+      </w:r>
+    </w:p>
+    <w:p>
+      <w:r>
+        <w:t xml:space="preserve">    "**/*.</w:t>
+      </w:r>
+      <w:proofErr w:type="spellStart"/>
+      <w:r>
+        <w:t>ts</w:t>
+      </w:r>
+      <w:proofErr w:type="spellEnd"/>
+      <w:r>
+        <w:t>"</w:t>
+      </w:r>
+    </w:p>
+    <w:p>
+      <w:r>
+        <w:t xml:space="preserve">  ]</w:t>
+      </w:r>
+    </w:p>
+    <w:p>
+      <w:r>
+        <w:t>}</w:t>
+      </w:r>
+    </w:p>
+    <w:p>
+      <w:r>
+        <w:t>*/</w:t>
+      </w:r>
+    </w:p>
+    <w:p>
+      <w:r>
+        <w:pict w14:anchorId="07DC7354">
+          <v:rect id="_x0000_i1031" style="width:0;height:1.5pt" o:hralign="center" o:hrstd="t" o:hr="t" fillcolor="#a0a0a0" stroked="f"/>
+        </w:pict>
+      </w:r>
+    </w:p>
+    <w:p>
+      <w:pPr>
+        <w:rPr>
+          <w:b/>
+          <w:bCs/>
+        </w:rPr>
+      </w:pPr>
+      <w:r>
+        <w:rPr>
+          <w:b/>
+          <w:bCs/>
+        </w:rPr>
+        <w:t>6. Playwright Configuration</w:t>
+      </w:r>
+    </w:p>
+    <w:p>
+      <w:proofErr w:type="spellStart"/>
+      <w:r>
+        <w:t>playwright.config.ts</w:t>
+      </w:r>
+      <w:proofErr w:type="spellEnd"/>
+    </w:p>
+    <w:p>
+      <w:r>
+        <w:t xml:space="preserve">import { </w:t>
+      </w:r>
+      <w:proofErr w:type="spellStart"/>
+      <w:r>
+        <w:t>defineConfig</w:t>
+      </w:r>
+      <w:proofErr w:type="spellEnd"/>
+      <w:r>
+        <w:t xml:space="preserve"> } from '@playwright/test';</w:t>
+      </w:r>
+    </w:p>
+    <w:p/>
+    <w:p>
+      <w:r>
+        <w:t xml:space="preserve">export default </w:t>
+      </w:r>
+      <w:proofErr w:type="spellStart"/>
+      <w:r>
+        <w:t>defineConfig</w:t>
+      </w:r>
+      <w:proofErr w:type="spellEnd"/>
+      <w:r>
+        <w:t>({</w:t>
+      </w:r>
+    </w:p>
+    <w:p/>
+    <w:p>
+      <w:r>
+        <w:t xml:space="preserve">    timeout: 60000,</w:t>
+      </w:r>
+    </w:p>
+    <w:p/>
+    <w:p>
+      <w:r>
+        <w:t xml:space="preserve">    use: {</w:t>
+      </w:r>
+    </w:p>
+    <w:p/>
+    <w:p>
+      <w:r>
+        <w:t xml:space="preserve">        headless: false,</w:t>
+      </w:r>
+    </w:p>
+    <w:p/>
+    <w:p>
+      <w:r>
+        <w:t xml:space="preserve">        viewport: {</w:t>
+      </w:r>
+    </w:p>
+    <w:p>
+      <w:r>
+        <w:t xml:space="preserve">            width: 1366,</w:t>
+      </w:r>
+    </w:p>
+    <w:p>
+      <w:r>
+        <w:t xml:space="preserve">            height: 768</w:t>
+      </w:r>
+    </w:p>
+    <w:p>
+      <w:r>
+        <w:t xml:space="preserve">        },</w:t>
+      </w:r>
+    </w:p>
+    <w:p/>
+    <w:p>
+      <w:r>
+        <w:t xml:space="preserve">        screenshot: "only-on-failure",</w:t>
+      </w:r>
+    </w:p>
+    <w:p/>
+    <w:p>
+      <w:r>
+        <w:t xml:space="preserve">        trace: "retain-on-failure",</w:t>
+      </w:r>
+    </w:p>
+    <w:p/>
+    <w:p>
+      <w:r>
+        <w:t xml:space="preserve">        video: "retain-on-failure"</w:t>
+      </w:r>
+    </w:p>
+    <w:p>
+      <w:r>
+        <w:t xml:space="preserve">    }</w:t>
+      </w:r>
+    </w:p>
+    <w:p/>
+    <w:p>
+      <w:r>
+        <w:t>});</w:t>
+      </w:r>
+    </w:p>
+    <w:p>
+      <w:r>
+        <w:pict w14:anchorId="2F411783">
+          <v:rect id="_x0000_i1032" style="width:0;height:1.5pt" o:hralign="center" o:hrstd="t" o:hr="t" fillcolor="#a0a0a0" stroked="f"/>
+        </w:pict>
+      </w:r>
+    </w:p>
+    <w:p>
+      <w:pPr>
+        <w:rPr>
+          <w:b/>
+          <w:bCs/>
+        </w:rPr>
+      </w:pPr>
+      <w:r>
+        <w:rPr>
+          <w:b/>
+          <w:bCs/>
+        </w:rPr>
+        <w:t>7. Cucumber Configuration</w:t>
+      </w:r>
+    </w:p>
+    <w:p>
+      <w:r>
+        <w:t xml:space="preserve">Create </w:t>
+      </w:r>
+      <w:r>
+        <w:rPr>
+          <w:b/>
+          <w:bCs/>
+        </w:rPr>
+        <w:t>cucumber.js</w:t>
+      </w:r>
+    </w:p>
+    <w:p>
+      <w:proofErr w:type="spellStart"/>
+      <w:r>
+        <w:t>module.exports</w:t>
+      </w:r>
+      <w:proofErr w:type="spellEnd"/>
+      <w:r>
+        <w:t xml:space="preserve"> = {</w:t>
+      </w:r>
+    </w:p>
+    <w:p/>
+    <w:p>
+      <w:r>
+        <w:t>default: {</w:t>
+      </w:r>
+    </w:p>
+    <w:p/>
+    <w:p>
+      <w:r>
+        <w:t>require: [</w:t>
+      </w:r>
+    </w:p>
+    <w:p/>
+    <w:p>
+      <w:r>
+        <w:t>'step-definitions/**/*.</w:t>
+      </w:r>
+      <w:proofErr w:type="spellStart"/>
+      <w:r>
+        <w:t>ts</w:t>
+      </w:r>
+      <w:proofErr w:type="spellEnd"/>
+      <w:r>
+        <w:t>',</w:t>
+      </w:r>
+    </w:p>
+    <w:p/>
+    <w:p>
+      <w:r>
+        <w:t>'hooks/**/*.</w:t>
+      </w:r>
+      <w:proofErr w:type="spellStart"/>
+      <w:r>
+        <w:t>ts'</w:t>
+      </w:r>
+      <w:proofErr w:type="spellEnd"/>
+    </w:p>
+    <w:p/>
+    <w:p>
+      <w:r>
+        <w:t>],</w:t>
+      </w:r>
+    </w:p>
+    <w:p/>
+    <w:p>
+      <w:proofErr w:type="spellStart"/>
+      <w:r>
+        <w:t>requireModule</w:t>
+      </w:r>
+      <w:proofErr w:type="spellEnd"/>
+      <w:r>
+        <w:t>: [</w:t>
+      </w:r>
+    </w:p>
+    <w:p/>
+    <w:p>
+      <w:r>
+        <w:t>'</w:t>
+      </w:r>
+      <w:proofErr w:type="spellStart"/>
+      <w:r>
+        <w:t>ts</w:t>
+      </w:r>
+      <w:proofErr w:type="spellEnd"/>
+      <w:r>
+        <w:t>-node/register'</w:t>
+      </w:r>
+    </w:p>
+    <w:p/>
+    <w:p>
+      <w:r>
+        <w:t>],</w:t>
+      </w:r>
+    </w:p>
+    <w:p/>
+    <w:p>
+      <w:r>
+        <w:t>format: [</w:t>
+      </w:r>
+    </w:p>
+    <w:p/>
+    <w:p>
+      <w:r>
+        <w:t>'progress',</w:t>
+      </w:r>
+    </w:p>
+    <w:p/>
+    <w:p>
+      <w:r>
+        <w:t>'</w:t>
+      </w:r>
+      <w:proofErr w:type="spellStart"/>
+      <w:r>
+        <w:t>html:reports</w:t>
+      </w:r>
+      <w:proofErr w:type="spellEnd"/>
+      <w:r>
+        <w:t>/cucumber-report.html',</w:t>
+      </w:r>
+    </w:p>
+    <w:p/>
+    <w:p>
+      <w:r>
+        <w:t>'</w:t>
+      </w:r>
+      <w:proofErr w:type="spellStart"/>
+      <w:r>
+        <w:t>json:reports</w:t>
+      </w:r>
+      <w:proofErr w:type="spellEnd"/>
+      <w:r>
+        <w:t>/</w:t>
+      </w:r>
+      <w:proofErr w:type="spellStart"/>
+      <w:r>
+        <w:t>cucumber.json</w:t>
+      </w:r>
+      <w:proofErr w:type="spellEnd"/>
+      <w:r>
+        <w:t>'</w:t>
+      </w:r>
+    </w:p>
+    <w:p/>
+    <w:p>
+      <w:r>
+        <w:t>],</w:t>
+      </w:r>
+    </w:p>
+    <w:p/>
+    <w:p>
+      <w:r>
+        <w:t>paths: [</w:t>
+      </w:r>
+    </w:p>
+    <w:p/>
+    <w:p>
+      <w:r>
+        <w:t>'features/**/*.feature'</w:t>
+      </w:r>
+    </w:p>
+    <w:p/>
+    <w:p>
+      <w:r>
+        <w:t>],</w:t>
+      </w:r>
+    </w:p>
+    <w:p/>
+    <w:p>
+      <w:proofErr w:type="spellStart"/>
+      <w:r>
+        <w:t>publishQuiet</w:t>
+      </w:r>
+      <w:proofErr w:type="spellEnd"/>
+      <w:r>
+        <w:t>: true</w:t>
+      </w:r>
+    </w:p>
+    <w:p/>
+    <w:p>
+      <w:r>
+        <w:t>}</w:t>
+      </w:r>
+    </w:p>
+    <w:p/>
+    <w:p>
+      <w:r>
+        <w:t>}</w:t>
+      </w:r>
+    </w:p>
+    <w:p>
+      <w:r>
         <w:lastRenderedPageBreak/>
-        <w:t xml:space="preserve">    "</w:t>
-      </w:r>
-      <w:proofErr w:type="spellStart"/>
-      <w:r>
-        <w:t>outDir</w:t>
-      </w:r>
-      <w:proofErr w:type="spellEnd"/>
-      <w:r>
-        <w:t>": "./</w:t>
-      </w:r>
-      <w:proofErr w:type="spellStart"/>
-      <w:r>
-        <w:t>dist</w:t>
-      </w:r>
-      <w:proofErr w:type="spellEnd"/>
-      <w:r>
-        <w:t>"</w:t>
-      </w:r>
-    </w:p>
-    <w:p>
-      <w:r>
-        <w:t xml:space="preserve">  },</w:t>
-      </w:r>
-    </w:p>
-    <w:p>
-      <w:r>
-        <w:t xml:space="preserve">  "include": [</w:t>
-      </w:r>
-    </w:p>
-    <w:p>
-      <w:r>
-        <w:t xml:space="preserve">    "**/*.</w:t>
-      </w:r>
-      <w:proofErr w:type="spellStart"/>
-      <w:r>
-        <w:t>ts</w:t>
-      </w:r>
-      <w:proofErr w:type="spellEnd"/>
-      <w:r>
-        <w:t>"</w:t>
-      </w:r>
-    </w:p>
-    <w:p>
-      <w:r>
-        <w:t xml:space="preserve">  ]</w:t>
-      </w:r>
-    </w:p>
+        <w:pict w14:anchorId="6F2FC6B1">
+          <v:rect id="_x0000_i1033" style="width:0;height:1.5pt" o:hralign="center" o:hrstd="t" o:hr="t" fillcolor="#a0a0a0" stroked="f"/>
+        </w:pict>
+      </w:r>
+    </w:p>
+    <w:p>
+      <w:pPr>
+        <w:rPr>
+          <w:b/>
+          <w:bCs/>
+        </w:rPr>
+      </w:pPr>
+      <w:r>
+        <w:rPr>
+          <w:b/>
+          <w:bCs/>
+        </w:rPr>
+        <w:t>8. Feature File</w:t>
+      </w:r>
+    </w:p>
+    <w:p>
+      <w:proofErr w:type="spellStart"/>
+      <w:r>
+        <w:t>Login.feature</w:t>
+      </w:r>
+      <w:proofErr w:type="spellEnd"/>
+    </w:p>
+    <w:p>
+      <w:r>
+        <w:t>Feature: Login</w:t>
+      </w:r>
+    </w:p>
+    <w:p/>
+    <w:p>
+      <w:r>
+        <w:t>Scenario: Successful Login</w:t>
+      </w:r>
+    </w:p>
+    <w:p/>
+    <w:p>
+      <w:r>
+        <w:t>Given User launches application</w:t>
+      </w:r>
+    </w:p>
+    <w:p/>
+    <w:p>
+      <w:r>
+        <w:t>When User enters username "Admin"</w:t>
+      </w:r>
+    </w:p>
+    <w:p/>
+    <w:p>
+      <w:r>
+        <w:t>And User enters password "admin123"</w:t>
+      </w:r>
+    </w:p>
+    <w:p/>
+    <w:p>
+      <w:r>
+        <w:t>And User clicks Login</w:t>
+      </w:r>
+    </w:p>
+    <w:p/>
+    <w:p>
+      <w:r>
+        <w:t>Then Dashboard should be displayed</w:t>
+      </w:r>
+    </w:p>
+    <w:p>
+      <w:r>
+        <w:pict w14:anchorId="16E666CB">
+          <v:rect id="_x0000_i1034" style="width:0;height:1.5pt" o:hralign="center" o:hrstd="t" o:hr="t" fillcolor="#a0a0a0" stroked="f"/>
+        </w:pict>
+      </w:r>
+    </w:p>
+    <w:p>
+      <w:pPr>
+        <w:rPr>
+          <w:b/>
+          <w:bCs/>
+        </w:rPr>
+      </w:pPr>
+      <w:r>
+        <w:rPr>
+          <w:b/>
+          <w:bCs/>
+        </w:rPr>
+        <w:t>9. World File</w:t>
+      </w:r>
+    </w:p>
+    <w:p>
+      <w:r>
+        <w:t>support/</w:t>
+      </w:r>
+      <w:proofErr w:type="spellStart"/>
+      <w:r>
+        <w:t>World.ts</w:t>
+      </w:r>
+      <w:proofErr w:type="spellEnd"/>
+    </w:p>
+    <w:p>
+      <w:r>
+        <w:t xml:space="preserve">import { Browser, </w:t>
+      </w:r>
+      <w:proofErr w:type="spellStart"/>
+      <w:r>
+        <w:t>BrowserContext</w:t>
+      </w:r>
+      <w:proofErr w:type="spellEnd"/>
+      <w:r>
+        <w:t>, chromium, Page } from 'playwright';</w:t>
+      </w:r>
+    </w:p>
+    <w:p>
+      <w:r>
+        <w:t xml:space="preserve">import { </w:t>
+      </w:r>
+      <w:proofErr w:type="spellStart"/>
+      <w:r>
+        <w:t>setWorldConstructor</w:t>
+      </w:r>
+      <w:proofErr w:type="spellEnd"/>
+      <w:r>
+        <w:t xml:space="preserve"> } from '@cucumber/cucumber';</w:t>
+      </w:r>
+    </w:p>
+    <w:p/>
+    <w:p>
+      <w:r>
+        <w:t xml:space="preserve">export class </w:t>
+      </w:r>
+      <w:proofErr w:type="spellStart"/>
+      <w:r>
+        <w:t>CustomWorld</w:t>
+      </w:r>
+      <w:proofErr w:type="spellEnd"/>
+      <w:r>
+        <w:t xml:space="preserve"> {</w:t>
+      </w:r>
+    </w:p>
+    <w:p/>
+    <w:p>
+      <w:proofErr w:type="gramStart"/>
+      <w:r>
+        <w:t>browser!:</w:t>
+      </w:r>
+      <w:proofErr w:type="gramEnd"/>
+      <w:r>
+        <w:t xml:space="preserve"> Browser;</w:t>
+      </w:r>
+    </w:p>
+    <w:p/>
+    <w:p>
+      <w:proofErr w:type="gramStart"/>
+      <w:r>
+        <w:t>context!:</w:t>
+      </w:r>
+      <w:proofErr w:type="gramEnd"/>
+      <w:r>
+        <w:t xml:space="preserve"> </w:t>
+      </w:r>
+      <w:proofErr w:type="spellStart"/>
+      <w:r>
+        <w:t>BrowserContext</w:t>
+      </w:r>
+      <w:proofErr w:type="spellEnd"/>
+      <w:r>
+        <w:t>;</w:t>
+      </w:r>
+    </w:p>
+    <w:p/>
+    <w:p>
+      <w:proofErr w:type="gramStart"/>
+      <w:r>
+        <w:lastRenderedPageBreak/>
+        <w:t>page!:</w:t>
+      </w:r>
+      <w:proofErr w:type="gramEnd"/>
+      <w:r>
+        <w:t xml:space="preserve"> Page;</w:t>
+      </w:r>
+    </w:p>
+    <w:p/>
     <w:p>
       <w:r>
         <w:t>}</w:t>
       </w:r>
     </w:p>
-    <w:p>
-      <w:r>
-        <w:pict w14:anchorId="07DC7354">
-          <v:rect id="_x0000_i1187" style="width:0;height:1.5pt" o:hralign="center" o:hrstd="t" o:hr="t" fillcolor="#a0a0a0" stroked="f"/>
+    <w:p/>
+    <w:p>
+      <w:proofErr w:type="spellStart"/>
+      <w:r>
+        <w:t>setWorldConstructor</w:t>
+      </w:r>
+      <w:proofErr w:type="spellEnd"/>
+      <w:r>
+        <w:t>(</w:t>
+      </w:r>
+      <w:proofErr w:type="spellStart"/>
+      <w:r>
+        <w:t>CustomWorld</w:t>
+      </w:r>
+      <w:proofErr w:type="spellEnd"/>
+      <w:r>
+        <w:t>);</w:t>
+      </w:r>
+    </w:p>
+    <w:p>
+      <w:r>
+        <w:pict w14:anchorId="20024234">
+          <v:rect id="_x0000_i1035" style="width:0;height:1.5pt" o:hralign="center" o:hrstd="t" o:hr="t" fillcolor="#a0a0a0" stroked="f"/>
         </w:pict>
       </w:r>
     </w:p>
@@ -975,37 +1695,1187 @@
           <w:b/>
           <w:bCs/>
         </w:rPr>
-        <w:t>6. Playwright Configuration</w:t>
-      </w:r>
-    </w:p>
-    <w:p>
-      <w:proofErr w:type="spellStart"/>
-      <w:r>
-        <w:t>playwright.config.ts</w:t>
-      </w:r>
-      <w:proofErr w:type="spellEnd"/>
-    </w:p>
+        <w:t>10. Hooks</w:t>
+      </w:r>
+    </w:p>
+    <w:p>
+      <w:r>
+        <w:t>hooks/</w:t>
+      </w:r>
+      <w:proofErr w:type="spellStart"/>
+      <w:r>
+        <w:t>Hooks.ts</w:t>
+      </w:r>
+      <w:proofErr w:type="spellEnd"/>
+    </w:p>
+    <w:p>
+      <w:r>
+        <w:t>import { Before, After } from '@cucumber/cucumber';</w:t>
+      </w:r>
+    </w:p>
+    <w:p>
+      <w:r>
+        <w:t>import { chromium } from 'playwright';</w:t>
+      </w:r>
+    </w:p>
+    <w:p/>
+    <w:p>
+      <w:r>
+        <w:t>Before(async function () {</w:t>
+      </w:r>
+    </w:p>
+    <w:p/>
+    <w:p>
+      <w:proofErr w:type="spellStart"/>
+      <w:r>
+        <w:t>this.browser</w:t>
+      </w:r>
+      <w:proofErr w:type="spellEnd"/>
+      <w:r>
+        <w:t xml:space="preserve"> = await </w:t>
+      </w:r>
+      <w:proofErr w:type="spellStart"/>
+      <w:r>
+        <w:t>chromium.launch</w:t>
+      </w:r>
+      <w:proofErr w:type="spellEnd"/>
+      <w:r>
+        <w:t>({</w:t>
+      </w:r>
+    </w:p>
+    <w:p/>
+    <w:p>
+      <w:r>
+        <w:t>headless: false</w:t>
+      </w:r>
+    </w:p>
+    <w:p/>
+    <w:p>
+      <w:r>
+        <w:t>});</w:t>
+      </w:r>
+    </w:p>
+    <w:p/>
+    <w:p>
+      <w:proofErr w:type="spellStart"/>
+      <w:r>
+        <w:t>this.context</w:t>
+      </w:r>
+      <w:proofErr w:type="spellEnd"/>
+      <w:r>
+        <w:t xml:space="preserve"> = await </w:t>
+      </w:r>
+      <w:proofErr w:type="spellStart"/>
+      <w:r>
+        <w:t>this.browser.newContext</w:t>
+      </w:r>
+      <w:proofErr w:type="spellEnd"/>
+      <w:r>
+        <w:t>();</w:t>
+      </w:r>
+    </w:p>
+    <w:p/>
+    <w:p>
+      <w:proofErr w:type="spellStart"/>
+      <w:r>
+        <w:t>this.page</w:t>
+      </w:r>
+      <w:proofErr w:type="spellEnd"/>
+      <w:r>
+        <w:t xml:space="preserve"> = await </w:t>
+      </w:r>
+      <w:proofErr w:type="spellStart"/>
+      <w:r>
+        <w:t>this.context.newPage</w:t>
+      </w:r>
+      <w:proofErr w:type="spellEnd"/>
+      <w:r>
+        <w:t>();</w:t>
+      </w:r>
+    </w:p>
+    <w:p/>
+    <w:p>
+      <w:r>
+        <w:t>});</w:t>
+      </w:r>
+    </w:p>
+    <w:p/>
+    <w:p>
+      <w:r>
+        <w:t>After(async function () {</w:t>
+      </w:r>
+    </w:p>
+    <w:p/>
+    <w:p>
+      <w:r>
+        <w:t xml:space="preserve">await </w:t>
+      </w:r>
+      <w:proofErr w:type="spellStart"/>
+      <w:r>
+        <w:t>this.browser.close</w:t>
+      </w:r>
+      <w:proofErr w:type="spellEnd"/>
+      <w:r>
+        <w:t>();</w:t>
+      </w:r>
+    </w:p>
+    <w:p/>
+    <w:p>
+      <w:r>
+        <w:t>});</w:t>
+      </w:r>
+    </w:p>
+    <w:p>
+      <w:r>
+        <w:pict w14:anchorId="11B2912C">
+          <v:rect id="_x0000_i1036" style="width:0;height:1.5pt" o:hralign="center" o:hrstd="t" o:hr="t" fillcolor="#a0a0a0" stroked="f"/>
+        </w:pict>
+      </w:r>
+    </w:p>
+    <w:p>
+      <w:pPr>
+        <w:rPr>
+          <w:b/>
+          <w:bCs/>
+        </w:rPr>
+      </w:pPr>
+      <w:r>
+        <w:rPr>
+          <w:b/>
+          <w:bCs/>
+        </w:rPr>
+        <w:t>11. Page Object</w:t>
+      </w:r>
+    </w:p>
+    <w:p>
+      <w:r>
+        <w:t>pages/</w:t>
+      </w:r>
+      <w:proofErr w:type="spellStart"/>
+      <w:r>
+        <w:t>LoginPage.ts</w:t>
+      </w:r>
+      <w:proofErr w:type="spellEnd"/>
+    </w:p>
+    <w:p>
+      <w:r>
+        <w:t>import { Page } from 'playwright';</w:t>
+      </w:r>
+    </w:p>
+    <w:p/>
+    <w:p>
+      <w:r>
+        <w:t xml:space="preserve">export class </w:t>
+      </w:r>
+      <w:proofErr w:type="spellStart"/>
+      <w:r>
+        <w:t>LoginPage</w:t>
+      </w:r>
+      <w:proofErr w:type="spellEnd"/>
+      <w:r>
+        <w:t xml:space="preserve"> {</w:t>
+      </w:r>
+    </w:p>
+    <w:p/>
+    <w:p>
+      <w:r>
+        <w:t>constructor(private page: Page){}</w:t>
+      </w:r>
+    </w:p>
+    <w:p/>
+    <w:p>
+      <w:r>
+        <w:t>async open(){</w:t>
+      </w:r>
+    </w:p>
+    <w:p/>
+    <w:p>
+      <w:r>
+        <w:t xml:space="preserve">await </w:t>
+      </w:r>
+      <w:proofErr w:type="spellStart"/>
+      <w:r>
+        <w:t>this.page.goto</w:t>
+      </w:r>
+      <w:proofErr w:type="spellEnd"/>
+      <w:r>
+        <w:t>("https://opensource-demo.orangehrmlive.com");</w:t>
+      </w:r>
+    </w:p>
+    <w:p/>
+    <w:p>
+      <w:r>
+        <w:t>}</w:t>
+      </w:r>
+    </w:p>
+    <w:p/>
+    <w:p>
+      <w:r>
+        <w:t>async login(</w:t>
+      </w:r>
+      <w:proofErr w:type="spellStart"/>
+      <w:r>
+        <w:t>username:string,password:string</w:t>
+      </w:r>
+      <w:proofErr w:type="spellEnd"/>
+      <w:r>
+        <w:t>){</w:t>
+      </w:r>
+    </w:p>
+    <w:p/>
+    <w:p>
+      <w:r>
+        <w:t xml:space="preserve">await </w:t>
+      </w:r>
+      <w:proofErr w:type="spellStart"/>
+      <w:r>
+        <w:t>this.page.locator</w:t>
+      </w:r>
+      <w:proofErr w:type="spellEnd"/>
+      <w:r>
+        <w:t>("input[name='username']").fill(username);</w:t>
+      </w:r>
+    </w:p>
+    <w:p/>
+    <w:p>
+      <w:r>
+        <w:t xml:space="preserve">await </w:t>
+      </w:r>
+      <w:proofErr w:type="spellStart"/>
+      <w:r>
+        <w:t>this.page.locator</w:t>
+      </w:r>
+      <w:proofErr w:type="spellEnd"/>
+      <w:r>
+        <w:t>("input[name='password']").fill(password);</w:t>
+      </w:r>
+    </w:p>
+    <w:p/>
+    <w:p>
+      <w:r>
+        <w:t xml:space="preserve">await </w:t>
+      </w:r>
+      <w:proofErr w:type="spellStart"/>
+      <w:r>
+        <w:t>this.page.locator</w:t>
+      </w:r>
+      <w:proofErr w:type="spellEnd"/>
+      <w:r>
+        <w:t>("button[type='submit']").click();</w:t>
+      </w:r>
+    </w:p>
+    <w:p/>
+    <w:p>
+      <w:r>
+        <w:t>}</w:t>
+      </w:r>
+    </w:p>
+    <w:p/>
+    <w:p>
+      <w:r>
+        <w:t>}</w:t>
+      </w:r>
+    </w:p>
+    <w:p>
+      <w:r>
+        <w:lastRenderedPageBreak/>
+        <w:pict w14:anchorId="0A77F504">
+          <v:rect id="_x0000_i1037" style="width:0;height:1.5pt" o:hralign="center" o:hrstd="t" o:hr="t" fillcolor="#a0a0a0" stroked="f"/>
+        </w:pict>
+      </w:r>
+    </w:p>
+    <w:p>
+      <w:pPr>
+        <w:rPr>
+          <w:b/>
+          <w:bCs/>
+        </w:rPr>
+      </w:pPr>
+      <w:r>
+        <w:rPr>
+          <w:b/>
+          <w:bCs/>
+        </w:rPr>
+        <w:t>12. Step Definitions</w:t>
+      </w:r>
+    </w:p>
+    <w:p>
+      <w:r>
+        <w:t>step-definitions/</w:t>
+      </w:r>
+      <w:proofErr w:type="spellStart"/>
+      <w:r>
+        <w:t>LoginSteps.ts</w:t>
+      </w:r>
+      <w:proofErr w:type="spellEnd"/>
+    </w:p>
+    <w:p>
+      <w:r>
+        <w:t>import { Given, When, Then } from '@cucumber/cucumber';</w:t>
+      </w:r>
+    </w:p>
+    <w:p/>
+    <w:p>
+      <w:r>
+        <w:t>import { expect } from '@playwright/test';</w:t>
+      </w:r>
+    </w:p>
+    <w:p/>
     <w:p>
       <w:r>
         <w:t xml:space="preserve">import { </w:t>
       </w:r>
       <w:proofErr w:type="spellStart"/>
       <w:r>
-        <w:t>defineConfig</w:t>
-      </w:r>
-      <w:proofErr w:type="spellEnd"/>
-      <w:r>
-        <w:t xml:space="preserve"> } from '@playwright/test';</w:t>
-      </w:r>
-    </w:p>
-    <w:p/>
-    <w:p>
-      <w:r>
-        <w:t xml:space="preserve">export default </w:t>
-      </w:r>
-      <w:proofErr w:type="spellStart"/>
-      <w:r>
-        <w:t>defineConfig</w:t>
+        <w:t>LoginPage</w:t>
+      </w:r>
+      <w:proofErr w:type="spellEnd"/>
+      <w:r>
+        <w:t xml:space="preserve"> } from </w:t>
+      </w:r>
+      <w:proofErr w:type="gramStart"/>
+      <w:r>
+        <w:t>'..</w:t>
+      </w:r>
+      <w:proofErr w:type="gramEnd"/>
+      <w:r>
+        <w:t>/pages/</w:t>
+      </w:r>
+      <w:proofErr w:type="spellStart"/>
+      <w:r>
+        <w:t>LoginPage</w:t>
+      </w:r>
+      <w:proofErr w:type="spellEnd"/>
+      <w:r>
+        <w:t>';</w:t>
+      </w:r>
+    </w:p>
+    <w:p/>
+    <w:p>
+      <w:r>
+        <w:t xml:space="preserve">let </w:t>
+      </w:r>
+      <w:proofErr w:type="spellStart"/>
+      <w:r>
+        <w:t>loginPage</w:t>
+      </w:r>
+      <w:proofErr w:type="spellEnd"/>
+      <w:r>
+        <w:t xml:space="preserve">: </w:t>
+      </w:r>
+      <w:proofErr w:type="spellStart"/>
+      <w:r>
+        <w:t>LoginPage</w:t>
+      </w:r>
+      <w:proofErr w:type="spellEnd"/>
+      <w:r>
+        <w:t>;</w:t>
+      </w:r>
+    </w:p>
+    <w:p/>
+    <w:p>
+      <w:r>
+        <w:t>Given('User launches application', async function () {</w:t>
+      </w:r>
+    </w:p>
+    <w:p/>
+    <w:p>
+      <w:proofErr w:type="spellStart"/>
+      <w:r>
+        <w:t>loginPage</w:t>
+      </w:r>
+      <w:proofErr w:type="spellEnd"/>
+      <w:r>
+        <w:t xml:space="preserve"> = new </w:t>
+      </w:r>
+      <w:proofErr w:type="spellStart"/>
+      <w:r>
+        <w:t>LoginPage</w:t>
+      </w:r>
+      <w:proofErr w:type="spellEnd"/>
+      <w:r>
+        <w:t>(</w:t>
+      </w:r>
+      <w:proofErr w:type="spellStart"/>
+      <w:r>
+        <w:t>this.page</w:t>
+      </w:r>
+      <w:proofErr w:type="spellEnd"/>
+      <w:r>
+        <w:t>);</w:t>
+      </w:r>
+    </w:p>
+    <w:p/>
+    <w:p>
+      <w:r>
+        <w:t xml:space="preserve">await </w:t>
+      </w:r>
+      <w:proofErr w:type="spellStart"/>
+      <w:r>
+        <w:t>loginPage.open</w:t>
+      </w:r>
+      <w:proofErr w:type="spellEnd"/>
+      <w:r>
+        <w:t>();</w:t>
+      </w:r>
+    </w:p>
+    <w:p/>
+    <w:p>
+      <w:r>
+        <w:t>});</w:t>
+      </w:r>
+    </w:p>
+    <w:p/>
+    <w:p>
+      <w:r>
+        <w:t>When('User enters username {string}', async function (username) {</w:t>
+      </w:r>
+    </w:p>
+    <w:p/>
+    <w:p>
+      <w:r>
+        <w:t xml:space="preserve">await </w:t>
+      </w:r>
+      <w:proofErr w:type="spellStart"/>
+      <w:r>
+        <w:t>this.page.fill</w:t>
+      </w:r>
+      <w:proofErr w:type="spellEnd"/>
+      <w:r>
+        <w:t>("input[name='username']", username);</w:t>
+      </w:r>
+    </w:p>
+    <w:p/>
+    <w:p>
+      <w:r>
+        <w:t>});</w:t>
+      </w:r>
+    </w:p>
+    <w:p/>
+    <w:p>
+      <w:r>
+        <w:t>When('User enters password {string}', async function (password) {</w:t>
+      </w:r>
+    </w:p>
+    <w:p/>
+    <w:p>
+      <w:r>
+        <w:t xml:space="preserve">await </w:t>
+      </w:r>
+      <w:proofErr w:type="spellStart"/>
+      <w:r>
+        <w:t>this.page.fill</w:t>
+      </w:r>
+      <w:proofErr w:type="spellEnd"/>
+      <w:r>
+        <w:t>("input[name='password']", password);</w:t>
+      </w:r>
+    </w:p>
+    <w:p/>
+    <w:p>
+      <w:r>
+        <w:t>});</w:t>
+      </w:r>
+    </w:p>
+    <w:p/>
+    <w:p>
+      <w:r>
+        <w:t>When('User clicks Login', async function () {</w:t>
+      </w:r>
+    </w:p>
+    <w:p/>
+    <w:p>
+      <w:r>
+        <w:t xml:space="preserve">await </w:t>
+      </w:r>
+      <w:proofErr w:type="spellStart"/>
+      <w:r>
+        <w:t>this.page.click</w:t>
+      </w:r>
+      <w:proofErr w:type="spellEnd"/>
+      <w:r>
+        <w:t>("button[type='submit']");</w:t>
+      </w:r>
+    </w:p>
+    <w:p/>
+    <w:p>
+      <w:r>
+        <w:t>});</w:t>
+      </w:r>
+    </w:p>
+    <w:p/>
+    <w:p>
+      <w:r>
+        <w:t>Then('Dashboard should be displayed', async function () {</w:t>
+      </w:r>
+    </w:p>
+    <w:p/>
+    <w:p>
+      <w:r>
+        <w:t>await expect(</w:t>
+      </w:r>
+      <w:proofErr w:type="spellStart"/>
+      <w:r>
+        <w:t>this.page</w:t>
+      </w:r>
+      <w:proofErr w:type="spellEnd"/>
+      <w:r>
+        <w:t>).</w:t>
+      </w:r>
+      <w:proofErr w:type="spellStart"/>
+      <w:r>
+        <w:t>toHaveURL</w:t>
+      </w:r>
+      <w:proofErr w:type="spellEnd"/>
+      <w:r>
+        <w:t>(/dashboard/);</w:t>
+      </w:r>
+    </w:p>
+    <w:p/>
+    <w:p>
+      <w:r>
+        <w:t>});</w:t>
+      </w:r>
+    </w:p>
+    <w:p>
+      <w:r>
+        <w:pict w14:anchorId="36FF5E7D">
+          <v:rect id="_x0000_i1038" style="width:0;height:1.5pt" o:hralign="center" o:hrstd="t" o:hr="t" fillcolor="#a0a0a0" stroked="f"/>
+        </w:pict>
+      </w:r>
+    </w:p>
+    <w:p>
+      <w:pPr>
+        <w:rPr>
+          <w:b/>
+          <w:bCs/>
+        </w:rPr>
+      </w:pPr>
+      <w:r>
+        <w:rPr>
+          <w:b/>
+          <w:bCs/>
+        </w:rPr>
+        <w:t xml:space="preserve">13. </w:t>
+      </w:r>
+      <w:proofErr w:type="spellStart"/>
+      <w:r>
+        <w:rPr>
+          <w:b/>
+          <w:bCs/>
+        </w:rPr>
+        <w:t>package.json</w:t>
+      </w:r>
+      <w:proofErr w:type="spellEnd"/>
+      <w:r>
+        <w:rPr>
+          <w:b/>
+          <w:bCs/>
+        </w:rPr>
+        <w:t xml:space="preserve"> Scripts</w:t>
+      </w:r>
+    </w:p>
+    <w:p>
+      <w:r>
+        <w:t>"scripts": {</w:t>
+      </w:r>
+    </w:p>
+    <w:p/>
+    <w:p>
+      <w:r>
+        <w:t>"test":"</w:t>
+      </w:r>
+      <w:proofErr w:type="spellStart"/>
+      <w:r>
+        <w:t>cu</w:t>
+      </w:r>
+      <w:proofErr w:type="spellEnd"/>
+      <w:r>
+        <w:t>cumber-js",</w:t>
+      </w:r>
+    </w:p>
+    <w:p/>
+    <w:p>
+      <w:r>
+        <w:t>"smoke":"</w:t>
+      </w:r>
+      <w:proofErr w:type="spellStart"/>
+      <w:r>
+        <w:t>cu</w:t>
+      </w:r>
+      <w:proofErr w:type="spellEnd"/>
+      <w:r>
+        <w:t>cumber-js --tags @Smoke",</w:t>
+      </w:r>
+    </w:p>
+    <w:p/>
+    <w:p>
+      <w:r>
+        <w:t>"regression":"</w:t>
+      </w:r>
+      <w:proofErr w:type="spellStart"/>
+      <w:r>
+        <w:t>cu</w:t>
+      </w:r>
+      <w:proofErr w:type="spellEnd"/>
+      <w:r>
+        <w:t>cumber-js --tags @Regression",</w:t>
+      </w:r>
+    </w:p>
+    <w:p/>
+    <w:p>
+      <w:r>
+        <w:t>"parallel":"</w:t>
+      </w:r>
+      <w:proofErr w:type="spellStart"/>
+      <w:r>
+        <w:t>cu</w:t>
+      </w:r>
+      <w:proofErr w:type="spellEnd"/>
+      <w:r>
+        <w:t>cumber-js --parallel 4"</w:t>
+      </w:r>
+    </w:p>
+    <w:p/>
+    <w:p>
+      <w:r>
+        <w:t>}</w:t>
+      </w:r>
+    </w:p>
+    <w:p>
+      <w:r>
+        <w:pict w14:anchorId="7DD8B88C">
+          <v:rect id="_x0000_i1039" style="width:0;height:1.5pt" o:hralign="center" o:hrstd="t" o:hr="t" fillcolor="#a0a0a0" stroked="f"/>
+        </w:pict>
+      </w:r>
+    </w:p>
+    <w:p>
+      <w:pPr>
+        <w:rPr>
+          <w:b/>
+          <w:bCs/>
+        </w:rPr>
+      </w:pPr>
+      <w:r>
+        <w:rPr>
+          <w:b/>
+          <w:bCs/>
+        </w:rPr>
+        <w:lastRenderedPageBreak/>
+        <w:t>14. Running Tests</w:t>
+      </w:r>
+    </w:p>
+    <w:p>
+      <w:r>
+        <w:t>Run all tests</w:t>
+      </w:r>
+    </w:p>
+    <w:p>
+      <w:proofErr w:type="spellStart"/>
+      <w:r>
+        <w:t>npm</w:t>
+      </w:r>
+      <w:proofErr w:type="spellEnd"/>
+      <w:r>
+        <w:t xml:space="preserve"> test</w:t>
+      </w:r>
+    </w:p>
+    <w:p>
+      <w:r>
+        <w:t>or</w:t>
+      </w:r>
+    </w:p>
+    <w:p>
+      <w:proofErr w:type="spellStart"/>
+      <w:r>
+        <w:t>npx</w:t>
+      </w:r>
+      <w:proofErr w:type="spellEnd"/>
+      <w:r>
+        <w:t xml:space="preserve"> cucumber-</w:t>
+      </w:r>
+      <w:proofErr w:type="spellStart"/>
+      <w:r>
+        <w:t>js</w:t>
+      </w:r>
+      <w:proofErr w:type="spellEnd"/>
+    </w:p>
+    <w:p>
+      <w:r>
+        <w:pict w14:anchorId="7E2CDC93">
+          <v:rect id="_x0000_i1040" style="width:0;height:1.5pt" o:hralign="center" o:hrstd="t" o:hr="t" fillcolor="#a0a0a0" stroked="f"/>
+        </w:pict>
+      </w:r>
+    </w:p>
+    <w:p>
+      <w:r>
+        <w:t>Run a feature</w:t>
+      </w:r>
+    </w:p>
+    <w:p>
+      <w:proofErr w:type="spellStart"/>
+      <w:r>
+        <w:t>npx</w:t>
+      </w:r>
+      <w:proofErr w:type="spellEnd"/>
+      <w:r>
+        <w:t xml:space="preserve"> cucumber-</w:t>
+      </w:r>
+      <w:proofErr w:type="spellStart"/>
+      <w:r>
+        <w:t>js</w:t>
+      </w:r>
+      <w:proofErr w:type="spellEnd"/>
+      <w:r>
+        <w:t xml:space="preserve"> features/</w:t>
+      </w:r>
+      <w:proofErr w:type="spellStart"/>
+      <w:r>
+        <w:t>Login.feature</w:t>
+      </w:r>
+      <w:proofErr w:type="spellEnd"/>
+    </w:p>
+    <w:p>
+      <w:r>
+        <w:pict w14:anchorId="1A16EE36">
+          <v:rect id="_x0000_i1041" style="width:0;height:1.5pt" o:hralign="center" o:hrstd="t" o:hr="t" fillcolor="#a0a0a0" stroked="f"/>
+        </w:pict>
+      </w:r>
+    </w:p>
+    <w:p>
+      <w:r>
+        <w:t>Run a scenario using tags</w:t>
+      </w:r>
+    </w:p>
+    <w:p>
+      <w:r>
+        <w:t>@Smoke</w:t>
+      </w:r>
+    </w:p>
+    <w:p>
+      <w:r>
+        <w:t>Scenario:</w:t>
+      </w:r>
+    </w:p>
+    <w:p>
+      <w:r>
+        <w:t>Execute</w:t>
+      </w:r>
+    </w:p>
+    <w:p>
+      <w:proofErr w:type="spellStart"/>
+      <w:r>
+        <w:rPr>
+          <w:highlight w:val="yellow"/>
+        </w:rPr>
+        <w:t>npx</w:t>
+      </w:r>
+      <w:proofErr w:type="spellEnd"/>
+      <w:r>
+        <w:rPr>
+          <w:highlight w:val="yellow"/>
+        </w:rPr>
+        <w:t xml:space="preserve"> cucumber-</w:t>
+      </w:r>
+      <w:proofErr w:type="spellStart"/>
+      <w:r>
+        <w:rPr>
+          <w:highlight w:val="yellow"/>
+        </w:rPr>
+        <w:t>js</w:t>
+      </w:r>
+      <w:proofErr w:type="spellEnd"/>
+      <w:r>
+        <w:rPr>
+          <w:highlight w:val="yellow"/>
+        </w:rPr>
+        <w:t xml:space="preserve"> --tags "@Smoke"</w:t>
+      </w:r>
+    </w:p>
+    <w:p>
+      <w:r>
+        <w:t>Multiple tags</w:t>
+      </w:r>
+    </w:p>
+    <w:p>
+      <w:proofErr w:type="spellStart"/>
+      <w:r>
+        <w:rPr>
+          <w:highlight w:val="yellow"/>
+        </w:rPr>
+        <w:t>npx</w:t>
+      </w:r>
+      <w:proofErr w:type="spellEnd"/>
+      <w:r>
+        <w:rPr>
+          <w:highlight w:val="yellow"/>
+        </w:rPr>
+        <w:t xml:space="preserve"> cucumber-</w:t>
+      </w:r>
+      <w:proofErr w:type="spellStart"/>
+      <w:r>
+        <w:rPr>
+          <w:highlight w:val="yellow"/>
+        </w:rPr>
+        <w:t>js</w:t>
+      </w:r>
+      <w:proofErr w:type="spellEnd"/>
+      <w:r>
+        <w:rPr>
+          <w:highlight w:val="yellow"/>
+        </w:rPr>
+        <w:t xml:space="preserve"> --tags "@Smoke and not @Regression"</w:t>
+      </w:r>
+    </w:p>
+    <w:p>
+      <w:r>
+        <w:pict w14:anchorId="7CBD5C5D">
+          <v:rect id="_x0000_i1042" style="width:0;height:1.5pt" o:hralign="center" o:hrstd="t" o:hr="t" fillcolor="#a0a0a0" stroked="f"/>
+        </w:pict>
+      </w:r>
+    </w:p>
+    <w:p>
+      <w:pPr>
+        <w:rPr>
+          <w:b/>
+          <w:bCs/>
+        </w:rPr>
+      </w:pPr>
+      <w:r>
+        <w:rPr>
+          <w:b/>
+          <w:bCs/>
+        </w:rPr>
+        <w:t>15. Reports</w:t>
+      </w:r>
+    </w:p>
+    <w:p>
+      <w:r>
+        <w:t>Generate HTML Report</w:t>
+      </w:r>
+    </w:p>
+    <w:p>
+      <w:proofErr w:type="spellStart"/>
+      <w:r>
+        <w:t>npx</w:t>
+      </w:r>
+      <w:proofErr w:type="spellEnd"/>
+      <w:r>
+        <w:t xml:space="preserve"> cucumber-</w:t>
+      </w:r>
+      <w:proofErr w:type="spellStart"/>
+      <w:r>
+        <w:t>js</w:t>
+      </w:r>
+      <w:proofErr w:type="spellEnd"/>
+    </w:p>
+    <w:p>
+      <w:r>
+        <w:t>Output</w:t>
+      </w:r>
+    </w:p>
+    <w:p>
+      <w:r>
+        <w:t>reports</w:t>
+      </w:r>
+    </w:p>
+    <w:p/>
+    <w:p>
+      <w:r>
+        <w:t>cucumber-report.html</w:t>
+      </w:r>
+    </w:p>
+    <w:p/>
+    <w:p>
+      <w:proofErr w:type="spellStart"/>
+      <w:r>
+        <w:t>cucumber.json</w:t>
+      </w:r>
+      <w:proofErr w:type="spellEnd"/>
+    </w:p>
+    <w:p>
+      <w:r>
+        <w:pict w14:anchorId="078D5852">
+          <v:rect id="_x0000_i1043" style="width:0;height:1.5pt" o:hralign="center" o:hrstd="t" o:hr="t" fillcolor="#a0a0a0" stroked="f"/>
+        </w:pict>
+      </w:r>
+    </w:p>
+    <w:p>
+      <w:pPr>
+        <w:rPr>
+          <w:b/>
+          <w:bCs/>
+        </w:rPr>
+      </w:pPr>
+      <w:r>
+        <w:rPr>
+          <w:b/>
+          <w:bCs/>
+        </w:rPr>
+        <w:t>Allure Report</w:t>
+      </w:r>
+    </w:p>
+    <w:p>
+      <w:r>
+        <w:lastRenderedPageBreak/>
+        <w:t>Run tests</w:t>
+      </w:r>
+    </w:p>
+    <w:p>
+      <w:proofErr w:type="spellStart"/>
+      <w:r>
+        <w:t>npx</w:t>
+      </w:r>
+      <w:proofErr w:type="spellEnd"/>
+      <w:r>
+        <w:t xml:space="preserve"> cucumber-</w:t>
+      </w:r>
+      <w:proofErr w:type="spellStart"/>
+      <w:r>
+        <w:t>js</w:t>
+      </w:r>
+      <w:proofErr w:type="spellEnd"/>
+    </w:p>
+    <w:p>
+      <w:r>
+        <w:t>Generate report</w:t>
+      </w:r>
+    </w:p>
+    <w:p>
+      <w:r>
+        <w:rPr>
+          <w:highlight w:val="yellow"/>
+        </w:rPr>
+        <w:t>allure generate allure-results --clean</w:t>
+      </w:r>
+    </w:p>
+    <w:p>
+      <w:r>
+        <w:t>Open report</w:t>
+      </w:r>
+    </w:p>
+    <w:p>
+      <w:r>
+        <w:t>allure open</w:t>
+      </w:r>
+    </w:p>
+    <w:p>
+      <w:r>
+        <w:pict w14:anchorId="5481F111">
+          <v:rect id="_x0000_i1044" style="width:0;height:1.5pt" o:hralign="center" o:hrstd="t" o:hr="t" fillcolor="#a0a0a0" stroked="f"/>
+        </w:pict>
+      </w:r>
+    </w:p>
+    <w:p>
+      <w:pPr>
+        <w:rPr>
+          <w:b/>
+          <w:bCs/>
+        </w:rPr>
+      </w:pPr>
+      <w:r>
+        <w:rPr>
+          <w:b/>
+          <w:bCs/>
+        </w:rPr>
+        <w:t>16. Screenshots on Failure</w:t>
+      </w:r>
+    </w:p>
+    <w:p>
+      <w:r>
+        <w:t>Inside After Hook</w:t>
+      </w:r>
+    </w:p>
+    <w:p>
+      <w:r>
+        <w:t>After(async function (scenario){</w:t>
+      </w:r>
+    </w:p>
+    <w:p/>
+    <w:p>
+      <w:r>
+        <w:t>if(</w:t>
+      </w:r>
+      <w:proofErr w:type="spellStart"/>
+      <w:r>
+        <w:t>scenario.</w:t>
+      </w:r>
+      <w:proofErr w:type="gramStart"/>
+      <w:r>
+        <w:t>result?.</w:t>
+      </w:r>
+      <w:proofErr w:type="gramEnd"/>
+      <w:r>
+        <w:t>status</w:t>
+      </w:r>
+      <w:proofErr w:type="spellEnd"/>
+      <w:r>
+        <w:t>==="FAILED"){</w:t>
+      </w:r>
+    </w:p>
+    <w:p/>
+    <w:p>
+      <w:proofErr w:type="spellStart"/>
+      <w:r>
+        <w:t>const</w:t>
+      </w:r>
+      <w:proofErr w:type="spellEnd"/>
+      <w:r>
+        <w:t xml:space="preserve"> image = await </w:t>
+      </w:r>
+      <w:proofErr w:type="spellStart"/>
+      <w:r>
+        <w:t>this.page.screenshot</w:t>
+      </w:r>
+      <w:proofErr w:type="spellEnd"/>
+      <w:r>
+        <w:t>();</w:t>
+      </w:r>
+    </w:p>
+    <w:p/>
+    <w:p>
+      <w:r>
+        <w:t xml:space="preserve">await </w:t>
+      </w:r>
+      <w:proofErr w:type="spellStart"/>
+      <w:r>
+        <w:t>this.attach</w:t>
+      </w:r>
+      <w:proofErr w:type="spellEnd"/>
+      <w:r>
+        <w:t>(</w:t>
+      </w:r>
+      <w:proofErr w:type="spellStart"/>
+      <w:r>
+        <w:t>image,'image</w:t>
+      </w:r>
+      <w:proofErr w:type="spellEnd"/>
+      <w:r>
+        <w:t>/</w:t>
+      </w:r>
+      <w:proofErr w:type="spellStart"/>
+      <w:r>
+        <w:t>png</w:t>
+      </w:r>
+      <w:proofErr w:type="spellEnd"/>
+      <w:r>
+        <w:t>');</w:t>
+      </w:r>
+    </w:p>
+    <w:p/>
+    <w:p>
+      <w:r>
+        <w:t>}</w:t>
+      </w:r>
+    </w:p>
+    <w:p/>
+    <w:p>
+      <w:r>
+        <w:t>});</w:t>
+      </w:r>
+    </w:p>
+    <w:p>
+      <w:r>
+        <w:pict w14:anchorId="180A0A9F">
+          <v:rect id="_x0000_i1045" style="width:0;height:1.5pt" o:hralign="center" o:hrstd="t" o:hr="t" fillcolor="#a0a0a0" stroked="f"/>
+        </w:pict>
+      </w:r>
+    </w:p>
+    <w:p>
+      <w:pPr>
+        <w:rPr>
+          <w:b/>
+          <w:bCs/>
+        </w:rPr>
+      </w:pPr>
+      <w:r>
+        <w:rPr>
+          <w:b/>
+          <w:bCs/>
+        </w:rPr>
+        <w:t>17. Environment Variables</w:t>
+      </w:r>
+    </w:p>
+    <w:p>
+      <w:r>
+        <w:t xml:space="preserve">Install </w:t>
+      </w:r>
+      <w:proofErr w:type="spellStart"/>
+      <w:r>
+        <w:t>dotenv</w:t>
+      </w:r>
+      <w:proofErr w:type="spellEnd"/>
+    </w:p>
+    <w:p>
+      <w:proofErr w:type="spellStart"/>
+      <w:r>
+        <w:t>npm</w:t>
+      </w:r>
+      <w:proofErr w:type="spellEnd"/>
+      <w:r>
+        <w:t xml:space="preserve"> install </w:t>
+      </w:r>
+      <w:proofErr w:type="spellStart"/>
+      <w:r>
+        <w:t>dotenv</w:t>
+      </w:r>
+      <w:proofErr w:type="spellEnd"/>
+    </w:p>
+    <w:p>
+      <w:r>
+        <w:t>.env.qa</w:t>
+      </w:r>
+    </w:p>
+    <w:p>
+      <w:r>
+        <w:t>BASE_URL=https://opensource-demo.orangehrmlive.com</w:t>
+      </w:r>
+    </w:p>
+    <w:p/>
+    <w:p>
+      <w:r>
+        <w:t>USERNAME=Admin</w:t>
+      </w:r>
+    </w:p>
+    <w:p/>
+    <w:p>
+      <w:r>
+        <w:t>PASSWORD=admin123</w:t>
+      </w:r>
+    </w:p>
+    <w:p>
+      <w:proofErr w:type="spellStart"/>
+      <w:r>
+        <w:t>Config.ts</w:t>
+      </w:r>
+      <w:proofErr w:type="spellEnd"/>
+    </w:p>
+    <w:p>
+      <w:r>
+        <w:t xml:space="preserve">import </w:t>
+      </w:r>
+      <w:proofErr w:type="spellStart"/>
+      <w:r>
+        <w:t>dotenv</w:t>
+      </w:r>
+      <w:proofErr w:type="spellEnd"/>
+      <w:r>
+        <w:t xml:space="preserve"> from '</w:t>
+      </w:r>
+      <w:proofErr w:type="spellStart"/>
+      <w:r>
+        <w:t>dotenv</w:t>
+      </w:r>
+      <w:proofErr w:type="spellEnd"/>
+      <w:r>
+        <w:t>';</w:t>
+      </w:r>
+    </w:p>
+    <w:p/>
+    <w:p>
+      <w:proofErr w:type="spellStart"/>
+      <w:r>
+        <w:t>dotenv.config</w:t>
       </w:r>
       <w:proofErr w:type="spellEnd"/>
       <w:r>
@@ -1014,65 +2884,13 @@
     </w:p>
     <w:p/>
     <w:p>
-      <w:r>
-        <w:t xml:space="preserve">    timeout: 60000,</w:t>
-      </w:r>
-    </w:p>
-    <w:p/>
-    <w:p>
-      <w:r>
-        <w:t xml:space="preserve">    use: {</w:t>
-      </w:r>
-    </w:p>
-    <w:p/>
-    <w:p>
-      <w:r>
-        <w:t xml:space="preserve">        headless: false,</w:t>
-      </w:r>
-    </w:p>
-    <w:p/>
-    <w:p>
-      <w:r>
-        <w:t xml:space="preserve">        viewport: {</w:t>
-      </w:r>
-    </w:p>
-    <w:p>
-      <w:r>
-        <w:t xml:space="preserve">            width: 1366,</w:t>
-      </w:r>
-    </w:p>
-    <w:p>
-      <w:r>
-        <w:t xml:space="preserve">            height: 768</w:t>
-      </w:r>
-    </w:p>
-    <w:p>
-      <w:r>
-        <w:t xml:space="preserve">        },</w:t>
-      </w:r>
-    </w:p>
-    <w:p/>
-    <w:p>
-      <w:r>
-        <w:t xml:space="preserve">        screenshot: "only-on-failure",</w:t>
-      </w:r>
-    </w:p>
-    <w:p/>
-    <w:p>
-      <w:r>
-        <w:t xml:space="preserve">        trace: "retain-on-failure",</w:t>
-      </w:r>
-    </w:p>
-    <w:p/>
-    <w:p>
-      <w:r>
-        <w:lastRenderedPageBreak/>
-        <w:t xml:space="preserve">        video: "retain-on-failure"</w:t>
-      </w:r>
-    </w:p>
-    <w:p>
-      <w:r>
-        <w:t xml:space="preserve">    }</w:t>
+      <w:proofErr w:type="spellStart"/>
+      <w:r>
+        <w:t>path:'.env.qa</w:t>
+      </w:r>
+      <w:proofErr w:type="spellEnd"/>
+      <w:r>
+        <w:t>'</w:t>
       </w:r>
     </w:p>
     <w:p/>
@@ -1081,10 +2899,60 @@
         <w:t>});</w:t>
       </w:r>
     </w:p>
-    <w:p>
-      <w:r>
-        <w:pict w14:anchorId="2F411783">
-          <v:rect id="_x0000_i1188" style="width:0;height:1.5pt" o:hralign="center" o:hrstd="t" o:hr="t" fillcolor="#a0a0a0" stroked="f"/>
+    <w:p/>
+    <w:p>
+      <w:r>
+        <w:t xml:space="preserve">export </w:t>
+      </w:r>
+      <w:proofErr w:type="spellStart"/>
+      <w:r>
+        <w:t>const</w:t>
+      </w:r>
+      <w:proofErr w:type="spellEnd"/>
+      <w:r>
+        <w:t xml:space="preserve"> Config={</w:t>
+      </w:r>
+    </w:p>
+    <w:p/>
+    <w:p>
+      <w:proofErr w:type="spellStart"/>
+      <w:r>
+        <w:t>baseURL:process.env.BASE_URL</w:t>
+      </w:r>
+      <w:proofErr w:type="spellEnd"/>
+      <w:r>
+        <w:t>,</w:t>
+      </w:r>
+    </w:p>
+    <w:p/>
+    <w:p>
+      <w:proofErr w:type="spellStart"/>
+      <w:r>
+        <w:t>username:process.env.USERNAME</w:t>
+      </w:r>
+      <w:proofErr w:type="spellEnd"/>
+      <w:r>
+        <w:t>,</w:t>
+      </w:r>
+    </w:p>
+    <w:p/>
+    <w:p>
+      <w:proofErr w:type="spellStart"/>
+      <w:r>
+        <w:t>password:process.env.PASSWORD</w:t>
+      </w:r>
+      <w:proofErr w:type="spellEnd"/>
+    </w:p>
+    <w:p/>
+    <w:p>
+      <w:r>
+        <w:t>}</w:t>
+      </w:r>
+    </w:p>
+    <w:p>
+      <w:r>
+        <w:pict w14:anchorId="54462963">
+          <v:rect id="_x0000_i1046" style="width:0;height:1.5pt" o:hralign="center" o:hrstd="t" o:hr="t" fillcolor="#a0a0a0" stroked="f"/>
         </w:pict>
       </w:r>
     </w:p>
@@ -1100,204 +2968,31 @@
           <w:b/>
           <w:bCs/>
         </w:rPr>
-        <w:t>7. Cucumber Configuration</w:t>
-      </w:r>
-    </w:p>
-    <w:p>
-      <w:r>
-        <w:t xml:space="preserve">Create </w:t>
-      </w:r>
-      <w:r>
-        <w:rPr>
-          <w:b/>
-          <w:bCs/>
-        </w:rPr>
-        <w:t>cucumber.js</w:t>
-      </w:r>
-    </w:p>
-    <w:p>
-      <w:proofErr w:type="spellStart"/>
-      <w:r>
-        <w:t>module.exports</w:t>
-      </w:r>
-      <w:proofErr w:type="spellEnd"/>
-      <w:r>
-        <w:t xml:space="preserve"> = {</w:t>
-      </w:r>
-    </w:p>
-    <w:p/>
-    <w:p>
-      <w:r>
-        <w:t>default: {</w:t>
-      </w:r>
-    </w:p>
-    <w:p/>
-    <w:p>
-      <w:r>
-        <w:t>require: [</w:t>
-      </w:r>
-    </w:p>
-    <w:p/>
-    <w:p>
-      <w:r>
-        <w:t>'step-definitions/**/*.</w:t>
-      </w:r>
-      <w:proofErr w:type="spellStart"/>
-      <w:r>
-        <w:t>ts</w:t>
-      </w:r>
-      <w:proofErr w:type="spellEnd"/>
-      <w:r>
-        <w:t>',</w:t>
-      </w:r>
-    </w:p>
-    <w:p/>
-    <w:p>
-      <w:r>
-        <w:t>'hooks/**/*.</w:t>
-      </w:r>
-      <w:proofErr w:type="spellStart"/>
-      <w:r>
-        <w:t>ts'</w:t>
-      </w:r>
-      <w:proofErr w:type="spellEnd"/>
-    </w:p>
-    <w:p/>
-    <w:p>
-      <w:r>
-        <w:t>],</w:t>
-      </w:r>
-    </w:p>
-    <w:p/>
-    <w:p>
-      <w:proofErr w:type="spellStart"/>
-      <w:r>
-        <w:t>requireModule</w:t>
-      </w:r>
-      <w:proofErr w:type="spellEnd"/>
-      <w:r>
-        <w:t>: [</w:t>
-      </w:r>
-    </w:p>
-    <w:p/>
-    <w:p>
-      <w:r>
-        <w:t>'</w:t>
-      </w:r>
-      <w:proofErr w:type="spellStart"/>
-      <w:r>
-        <w:t>ts</w:t>
-      </w:r>
-      <w:proofErr w:type="spellEnd"/>
-      <w:r>
-        <w:t>-node/register'</w:t>
-      </w:r>
-    </w:p>
-    <w:p/>
-    <w:p>
-      <w:r>
-        <w:t>],</w:t>
-      </w:r>
-    </w:p>
-    <w:p/>
-    <w:p>
-      <w:r>
-        <w:t>format: [</w:t>
-      </w:r>
-    </w:p>
-    <w:p/>
-    <w:p>
-      <w:r>
-        <w:t>'progress',</w:t>
-      </w:r>
-    </w:p>
-    <w:p/>
-    <w:p>
-      <w:r>
-        <w:t>'</w:t>
-      </w:r>
-      <w:proofErr w:type="spellStart"/>
-      <w:r>
-        <w:t>html:reports</w:t>
-      </w:r>
-      <w:proofErr w:type="spellEnd"/>
-      <w:r>
-        <w:t>/cucumber-report.html',</w:t>
-      </w:r>
-    </w:p>
-    <w:p/>
-    <w:p>
-      <w:r>
-        <w:t>'</w:t>
-      </w:r>
-      <w:proofErr w:type="spellStart"/>
-      <w:r>
-        <w:t>json:reports</w:t>
-      </w:r>
-      <w:proofErr w:type="spellEnd"/>
-      <w:r>
-        <w:t>/</w:t>
-      </w:r>
-      <w:proofErr w:type="spellStart"/>
-      <w:r>
-        <w:t>cucumber.json</w:t>
-      </w:r>
-      <w:proofErr w:type="spellEnd"/>
-      <w:r>
-        <w:t>'</w:t>
-      </w:r>
-    </w:p>
-    <w:p/>
-    <w:p>
-      <w:r>
-        <w:t>],</w:t>
-      </w:r>
-    </w:p>
-    <w:p/>
-    <w:p>
-      <w:r>
-        <w:t>paths: [</w:t>
-      </w:r>
-    </w:p>
-    <w:p/>
-    <w:p>
-      <w:r>
-        <w:t>'features/**/*.feature'</w:t>
-      </w:r>
-    </w:p>
-    <w:p/>
-    <w:p>
-      <w:r>
-        <w:t>],</w:t>
-      </w:r>
-    </w:p>
-    <w:p/>
-    <w:p>
-      <w:proofErr w:type="spellStart"/>
-      <w:r>
-        <w:t>publishQuiet</w:t>
-      </w:r>
-      <w:proofErr w:type="spellEnd"/>
-      <w:r>
-        <w:t>: true</w:t>
-      </w:r>
-    </w:p>
-    <w:p/>
-    <w:p>
-      <w:r>
-        <w:t>}</w:t>
-      </w:r>
-    </w:p>
-    <w:p/>
-    <w:p>
-      <w:r>
-        <w:t>}</w:t>
-      </w:r>
-    </w:p>
-    <w:p>
-      <w:r>
-        <w:pict w14:anchorId="6F2FC6B1">
-          <v:rect id="_x0000_i1189" style="width:0;height:1.5pt" o:hralign="center" o:hrstd="t" o:hr="t" fillcolor="#a0a0a0" stroked="f"/>
+        <w:t>18. Parallel Execution</w:t>
+      </w:r>
+    </w:p>
+    <w:p>
+      <w:proofErr w:type="spellStart"/>
+      <w:r>
+        <w:t>npx</w:t>
+      </w:r>
+      <w:proofErr w:type="spellEnd"/>
+      <w:r>
+        <w:t xml:space="preserve"> cucumber-</w:t>
+      </w:r>
+      <w:proofErr w:type="spellStart"/>
+      <w:r>
+        <w:t>js</w:t>
+      </w:r>
+      <w:proofErr w:type="spellEnd"/>
+      <w:r>
+        <w:t xml:space="preserve"> --parallel 4</w:t>
+      </w:r>
+    </w:p>
+    <w:p>
+      <w:r>
+        <w:pict w14:anchorId="22AE9A93">
+          <v:rect id="_x0000_i1047" style="width:0;height:1.5pt" o:hralign="center" o:hrstd="t" o:hr="t" fillcolor="#a0a0a0" stroked="f"/>
         </w:pict>
       </w:r>
     </w:p>
@@ -1313,900 +3008,7 @@
           <w:b/>
           <w:bCs/>
         </w:rPr>
-        <w:t>8. Feature File</w:t>
-      </w:r>
-    </w:p>
-    <w:p>
-      <w:proofErr w:type="spellStart"/>
-      <w:r>
-        <w:t>Login.feature</w:t>
-      </w:r>
-      <w:proofErr w:type="spellEnd"/>
-    </w:p>
-    <w:p>
-      <w:r>
-        <w:t>Feature: Login</w:t>
-      </w:r>
-    </w:p>
-    <w:p/>
-    <w:p>
-      <w:r>
-        <w:t>Scenario: Successful Login</w:t>
-      </w:r>
-    </w:p>
-    <w:p/>
-    <w:p>
-      <w:r>
-        <w:t>Given User launches application</w:t>
-      </w:r>
-    </w:p>
-    <w:p/>
-    <w:p>
-      <w:r>
-        <w:t>When User enters username "Admin"</w:t>
-      </w:r>
-    </w:p>
-    <w:p/>
-    <w:p>
-      <w:r>
-        <w:t>And User enters password "admin123"</w:t>
-      </w:r>
-    </w:p>
-    <w:p/>
-    <w:p>
-      <w:r>
-        <w:t>And User clicks Login</w:t>
-      </w:r>
-    </w:p>
-    <w:p/>
-    <w:p>
-      <w:r>
-        <w:t>Then Dashboard should be displayed</w:t>
-      </w:r>
-    </w:p>
-    <w:p>
-      <w:r>
-        <w:pict w14:anchorId="16E666CB">
-          <v:rect id="_x0000_i1190" style="width:0;height:1.5pt" o:hralign="center" o:hrstd="t" o:hr="t" fillcolor="#a0a0a0" stroked="f"/>
-        </w:pict>
-      </w:r>
-    </w:p>
-    <w:p>
-      <w:pPr>
-        <w:rPr>
-          <w:b/>
-          <w:bCs/>
-        </w:rPr>
-      </w:pPr>
-      <w:r>
-        <w:rPr>
-          <w:b/>
-          <w:bCs/>
-        </w:rPr>
-        <w:t>9. World File</w:t>
-      </w:r>
-    </w:p>
-    <w:p>
-      <w:r>
-        <w:t>support/</w:t>
-      </w:r>
-      <w:proofErr w:type="spellStart"/>
-      <w:r>
-        <w:t>World.ts</w:t>
-      </w:r>
-      <w:proofErr w:type="spellEnd"/>
-    </w:p>
-    <w:p>
-      <w:r>
-        <w:t xml:space="preserve">import { Browser, </w:t>
-      </w:r>
-      <w:proofErr w:type="spellStart"/>
-      <w:r>
-        <w:t>BrowserContext</w:t>
-      </w:r>
-      <w:proofErr w:type="spellEnd"/>
-      <w:r>
-        <w:t>, chromium, Page } from 'playwright';</w:t>
-      </w:r>
-    </w:p>
-    <w:p>
-      <w:r>
-        <w:t xml:space="preserve">import { </w:t>
-      </w:r>
-      <w:proofErr w:type="spellStart"/>
-      <w:r>
-        <w:t>setWorldConstructor</w:t>
-      </w:r>
-      <w:proofErr w:type="spellEnd"/>
-      <w:r>
-        <w:t xml:space="preserve"> } from '@cucumber/cucumber';</w:t>
-      </w:r>
-    </w:p>
-    <w:p/>
-    <w:p>
-      <w:r>
-        <w:t xml:space="preserve">export class </w:t>
-      </w:r>
-      <w:proofErr w:type="spellStart"/>
-      <w:r>
-        <w:t>CustomWorld</w:t>
-      </w:r>
-      <w:proofErr w:type="spellEnd"/>
-      <w:r>
-        <w:t xml:space="preserve"> {</w:t>
-      </w:r>
-    </w:p>
-    <w:p/>
-    <w:p>
-      <w:proofErr w:type="gramStart"/>
-      <w:r>
-        <w:t>browser!:</w:t>
-      </w:r>
-      <w:proofErr w:type="gramEnd"/>
-      <w:r>
-        <w:t xml:space="preserve"> Browser;</w:t>
-      </w:r>
-    </w:p>
-    <w:p/>
-    <w:p>
-      <w:proofErr w:type="gramStart"/>
-      <w:r>
-        <w:t>context!:</w:t>
-      </w:r>
-      <w:proofErr w:type="gramEnd"/>
-      <w:r>
-        <w:t xml:space="preserve"> </w:t>
-      </w:r>
-      <w:proofErr w:type="spellStart"/>
-      <w:r>
-        <w:t>BrowserContext</w:t>
-      </w:r>
-      <w:proofErr w:type="spellEnd"/>
-      <w:r>
-        <w:t>;</w:t>
-      </w:r>
-    </w:p>
-    <w:p/>
-    <w:p>
-      <w:proofErr w:type="gramStart"/>
-      <w:r>
-        <w:t>page!:</w:t>
-      </w:r>
-      <w:proofErr w:type="gramEnd"/>
-      <w:r>
-        <w:t xml:space="preserve"> Page;</w:t>
-      </w:r>
-    </w:p>
-    <w:p/>
-    <w:p>
-      <w:r>
-        <w:t>}</w:t>
-      </w:r>
-    </w:p>
-    <w:p/>
-    <w:p>
-      <w:proofErr w:type="spellStart"/>
-      <w:r>
-        <w:t>setWorldConstructor</w:t>
-      </w:r>
-      <w:proofErr w:type="spellEnd"/>
-      <w:r>
-        <w:t>(</w:t>
-      </w:r>
-      <w:proofErr w:type="spellStart"/>
-      <w:r>
-        <w:t>CustomWorld</w:t>
-      </w:r>
-      <w:proofErr w:type="spellEnd"/>
-      <w:r>
-        <w:t>);</w:t>
-      </w:r>
-    </w:p>
-    <w:p>
-      <w:r>
-        <w:pict w14:anchorId="20024234">
-          <v:rect id="_x0000_i1191" style="width:0;height:1.5pt" o:hralign="center" o:hrstd="t" o:hr="t" fillcolor="#a0a0a0" stroked="f"/>
-        </w:pict>
-      </w:r>
-    </w:p>
-    <w:p>
-      <w:pPr>
-        <w:rPr>
-          <w:b/>
-          <w:bCs/>
-        </w:rPr>
-      </w:pPr>
-      <w:r>
-        <w:rPr>
-          <w:b/>
-          <w:bCs/>
-        </w:rPr>
-        <w:t>10. Hooks</w:t>
-      </w:r>
-    </w:p>
-    <w:p>
-      <w:r>
-        <w:t>hooks/</w:t>
-      </w:r>
-      <w:proofErr w:type="spellStart"/>
-      <w:r>
-        <w:t>Hooks.ts</w:t>
-      </w:r>
-      <w:proofErr w:type="spellEnd"/>
-    </w:p>
-    <w:p>
-      <w:r>
-        <w:t>import { Before, After } from '@cucumber/cucumber';</w:t>
-      </w:r>
-    </w:p>
-    <w:p>
-      <w:r>
-        <w:t>import { chromium } from 'playwright';</w:t>
-      </w:r>
-    </w:p>
-    <w:p/>
-    <w:p>
-      <w:r>
-        <w:t>Before(async function () {</w:t>
-      </w:r>
-    </w:p>
-    <w:p/>
-    <w:p>
-      <w:proofErr w:type="spellStart"/>
-      <w:r>
-        <w:t>this.browser</w:t>
-      </w:r>
-      <w:proofErr w:type="spellEnd"/>
-      <w:r>
-        <w:t xml:space="preserve"> = await </w:t>
-      </w:r>
-      <w:proofErr w:type="spellStart"/>
-      <w:r>
-        <w:t>chromium.launch</w:t>
-      </w:r>
-      <w:proofErr w:type="spellEnd"/>
-      <w:r>
-        <w:t>({</w:t>
-      </w:r>
-    </w:p>
-    <w:p/>
-    <w:p>
-      <w:r>
-        <w:t>headless: false</w:t>
-      </w:r>
-    </w:p>
-    <w:p/>
-    <w:p>
-      <w:r>
-        <w:t>});</w:t>
-      </w:r>
-    </w:p>
-    <w:p/>
-    <w:p>
-      <w:proofErr w:type="spellStart"/>
-      <w:r>
-        <w:t>this.context</w:t>
-      </w:r>
-      <w:proofErr w:type="spellEnd"/>
-      <w:r>
-        <w:t xml:space="preserve"> = await </w:t>
-      </w:r>
-      <w:proofErr w:type="spellStart"/>
-      <w:r>
-        <w:t>this.browser.newContext</w:t>
-      </w:r>
-      <w:proofErr w:type="spellEnd"/>
-      <w:r>
-        <w:t>();</w:t>
-      </w:r>
-    </w:p>
-    <w:p/>
-    <w:p>
-      <w:proofErr w:type="spellStart"/>
-      <w:r>
-        <w:t>this.page</w:t>
-      </w:r>
-      <w:proofErr w:type="spellEnd"/>
-      <w:r>
-        <w:t xml:space="preserve"> = await </w:t>
-      </w:r>
-      <w:proofErr w:type="spellStart"/>
-      <w:r>
-        <w:t>this.context.newPage</w:t>
-      </w:r>
-      <w:proofErr w:type="spellEnd"/>
-      <w:r>
-        <w:t>();</w:t>
-      </w:r>
-    </w:p>
-    <w:p/>
-    <w:p>
-      <w:r>
-        <w:t>});</w:t>
-      </w:r>
-    </w:p>
-    <w:p/>
-    <w:p>
-      <w:r>
-        <w:t>After(async function () {</w:t>
-      </w:r>
-    </w:p>
-    <w:p/>
-    <w:p>
-      <w:r>
-        <w:t xml:space="preserve">await </w:t>
-      </w:r>
-      <w:proofErr w:type="spellStart"/>
-      <w:r>
-        <w:t>this.browser.close</w:t>
-      </w:r>
-      <w:proofErr w:type="spellEnd"/>
-      <w:r>
-        <w:t>();</w:t>
-      </w:r>
-    </w:p>
-    <w:p/>
-    <w:p>
-      <w:r>
-        <w:t>});</w:t>
-      </w:r>
-    </w:p>
-    <w:p>
-      <w:r>
-        <w:pict w14:anchorId="11B2912C">
-          <v:rect id="_x0000_i1192" style="width:0;height:1.5pt" o:hralign="center" o:hrstd="t" o:hr="t" fillcolor="#a0a0a0" stroked="f"/>
-        </w:pict>
-      </w:r>
-    </w:p>
-    <w:p>
-      <w:pPr>
-        <w:rPr>
-          <w:b/>
-          <w:bCs/>
-        </w:rPr>
-      </w:pPr>
-      <w:r>
-        <w:rPr>
-          <w:b/>
-          <w:bCs/>
-        </w:rPr>
-        <w:t>11. Page Object</w:t>
-      </w:r>
-    </w:p>
-    <w:p>
-      <w:r>
-        <w:t>pages/</w:t>
-      </w:r>
-      <w:proofErr w:type="spellStart"/>
-      <w:r>
-        <w:t>LoginPage.ts</w:t>
-      </w:r>
-      <w:proofErr w:type="spellEnd"/>
-    </w:p>
-    <w:p>
-      <w:r>
-        <w:t>import { Page } from 'playwright';</w:t>
-      </w:r>
-    </w:p>
-    <w:p/>
-    <w:p>
-      <w:r>
-        <w:t xml:space="preserve">export class </w:t>
-      </w:r>
-      <w:proofErr w:type="spellStart"/>
-      <w:r>
-        <w:t>LoginPage</w:t>
-      </w:r>
-      <w:proofErr w:type="spellEnd"/>
-      <w:r>
-        <w:t xml:space="preserve"> {</w:t>
-      </w:r>
-    </w:p>
-    <w:p/>
-    <w:p>
-      <w:r>
-        <w:t>constructor(private page: Page){}</w:t>
-      </w:r>
-    </w:p>
-    <w:p/>
-    <w:p>
-      <w:r>
-        <w:t>async open(){</w:t>
-      </w:r>
-    </w:p>
-    <w:p/>
-    <w:p>
-      <w:r>
-        <w:t xml:space="preserve">await </w:t>
-      </w:r>
-      <w:proofErr w:type="spellStart"/>
-      <w:r>
-        <w:t>this.page.goto</w:t>
-      </w:r>
-      <w:proofErr w:type="spellEnd"/>
-      <w:r>
-        <w:t>("https://opensource-demo.orangehrmlive.com");</w:t>
-      </w:r>
-    </w:p>
-    <w:p/>
-    <w:p>
-      <w:r>
-        <w:t>}</w:t>
-      </w:r>
-    </w:p>
-    <w:p/>
-    <w:p>
-      <w:r>
-        <w:t>async login(</w:t>
-      </w:r>
-      <w:proofErr w:type="spellStart"/>
-      <w:r>
-        <w:t>username:string,password:string</w:t>
-      </w:r>
-      <w:proofErr w:type="spellEnd"/>
-      <w:r>
-        <w:t>){</w:t>
-      </w:r>
-    </w:p>
-    <w:p/>
-    <w:p>
-      <w:r>
-        <w:t xml:space="preserve">await </w:t>
-      </w:r>
-      <w:proofErr w:type="spellStart"/>
-      <w:r>
-        <w:t>this.page.locator</w:t>
-      </w:r>
-      <w:proofErr w:type="spellEnd"/>
-      <w:r>
-        <w:t>("input[name='username']").fill(username);</w:t>
-      </w:r>
-    </w:p>
-    <w:p/>
-    <w:p>
-      <w:r>
-        <w:t xml:space="preserve">await </w:t>
-      </w:r>
-      <w:proofErr w:type="spellStart"/>
-      <w:r>
-        <w:t>this.page.locator</w:t>
-      </w:r>
-      <w:proofErr w:type="spellEnd"/>
-      <w:r>
-        <w:t>("input[name='password']").fill(password);</w:t>
-      </w:r>
-    </w:p>
-    <w:p/>
-    <w:p>
-      <w:r>
-        <w:t xml:space="preserve">await </w:t>
-      </w:r>
-      <w:proofErr w:type="spellStart"/>
-      <w:r>
-        <w:t>this.page.locator</w:t>
-      </w:r>
-      <w:proofErr w:type="spellEnd"/>
-      <w:r>
-        <w:t>("button[type='submit']").click();</w:t>
-      </w:r>
-    </w:p>
-    <w:p/>
-    <w:p>
-      <w:r>
-        <w:t>}</w:t>
-      </w:r>
-    </w:p>
-    <w:p/>
-    <w:p>
-      <w:r>
-        <w:t>}</w:t>
-      </w:r>
-    </w:p>
-    <w:p>
-      <w:r>
-        <w:pict w14:anchorId="0A77F504">
-          <v:rect id="_x0000_i1193" style="width:0;height:1.5pt" o:hralign="center" o:hrstd="t" o:hr="t" fillcolor="#a0a0a0" stroked="f"/>
-        </w:pict>
-      </w:r>
-    </w:p>
-    <w:p>
-      <w:pPr>
-        <w:rPr>
-          <w:b/>
-          <w:bCs/>
-        </w:rPr>
-      </w:pPr>
-      <w:r>
-        <w:rPr>
-          <w:b/>
-          <w:bCs/>
-        </w:rPr>
-        <w:t>12. Step Definitions</w:t>
-      </w:r>
-    </w:p>
-    <w:p>
-      <w:r>
-        <w:t>step-definitions/</w:t>
-      </w:r>
-      <w:proofErr w:type="spellStart"/>
-      <w:r>
-        <w:t>LoginSteps.ts</w:t>
-      </w:r>
-      <w:proofErr w:type="spellEnd"/>
-    </w:p>
-    <w:p>
-      <w:r>
-        <w:t>import { Given, When, Then } from '@cucumber/cucumber';</w:t>
-      </w:r>
-    </w:p>
-    <w:p/>
-    <w:p>
-      <w:r>
-        <w:t>import { expect } from '@playwright/test';</w:t>
-      </w:r>
-    </w:p>
-    <w:p/>
-    <w:p>
-      <w:r>
-        <w:t xml:space="preserve">import { </w:t>
-      </w:r>
-      <w:proofErr w:type="spellStart"/>
-      <w:r>
-        <w:t>LoginPage</w:t>
-      </w:r>
-      <w:proofErr w:type="spellEnd"/>
-      <w:r>
-        <w:t xml:space="preserve"> } from </w:t>
-      </w:r>
-      <w:proofErr w:type="gramStart"/>
-      <w:r>
-        <w:t>'..</w:t>
-      </w:r>
-      <w:proofErr w:type="gramEnd"/>
-      <w:r>
-        <w:t>/pages/</w:t>
-      </w:r>
-      <w:proofErr w:type="spellStart"/>
-      <w:r>
-        <w:t>LoginPage</w:t>
-      </w:r>
-      <w:proofErr w:type="spellEnd"/>
-      <w:r>
-        <w:t>';</w:t>
-      </w:r>
-    </w:p>
-    <w:p/>
-    <w:p>
-      <w:r>
-        <w:t xml:space="preserve">let </w:t>
-      </w:r>
-      <w:proofErr w:type="spellStart"/>
-      <w:r>
-        <w:t>loginPage</w:t>
-      </w:r>
-      <w:proofErr w:type="spellEnd"/>
-      <w:r>
-        <w:t xml:space="preserve">: </w:t>
-      </w:r>
-      <w:proofErr w:type="spellStart"/>
-      <w:r>
-        <w:t>LoginPage</w:t>
-      </w:r>
-      <w:proofErr w:type="spellEnd"/>
-      <w:r>
-        <w:t>;</w:t>
-      </w:r>
-    </w:p>
-    <w:p/>
-    <w:p>
-      <w:r>
-        <w:t>Given('User launches application', async function () {</w:t>
-      </w:r>
-    </w:p>
-    <w:p/>
-    <w:p>
-      <w:proofErr w:type="spellStart"/>
-      <w:r>
-        <w:t>loginPage</w:t>
-      </w:r>
-      <w:proofErr w:type="spellEnd"/>
-      <w:r>
-        <w:t xml:space="preserve"> = new </w:t>
-      </w:r>
-      <w:proofErr w:type="spellStart"/>
-      <w:r>
-        <w:t>LoginPage</w:t>
-      </w:r>
-      <w:proofErr w:type="spellEnd"/>
-      <w:r>
-        <w:t>(</w:t>
-      </w:r>
-      <w:proofErr w:type="spellStart"/>
-      <w:r>
-        <w:t>this.page</w:t>
-      </w:r>
-      <w:proofErr w:type="spellEnd"/>
-      <w:r>
-        <w:t>);</w:t>
-      </w:r>
-    </w:p>
-    <w:p/>
-    <w:p>
-      <w:r>
-        <w:t xml:space="preserve">await </w:t>
-      </w:r>
-      <w:proofErr w:type="spellStart"/>
-      <w:r>
-        <w:t>loginPage.open</w:t>
-      </w:r>
-      <w:proofErr w:type="spellEnd"/>
-      <w:r>
-        <w:t>();</w:t>
-      </w:r>
-    </w:p>
-    <w:p/>
-    <w:p>
-      <w:r>
-        <w:t>});</w:t>
-      </w:r>
-    </w:p>
-    <w:p/>
-    <w:p>
-      <w:r>
-        <w:t>When('User enters username {string}', async function (username) {</w:t>
-      </w:r>
-    </w:p>
-    <w:p/>
-    <w:p>
-      <w:r>
-        <w:t xml:space="preserve">await </w:t>
-      </w:r>
-      <w:proofErr w:type="spellStart"/>
-      <w:r>
-        <w:t>this.page.fill</w:t>
-      </w:r>
-      <w:proofErr w:type="spellEnd"/>
-      <w:r>
-        <w:t>("input[name='username']", username);</w:t>
-      </w:r>
-    </w:p>
-    <w:p/>
-    <w:p>
-      <w:r>
-        <w:t>});</w:t>
-      </w:r>
-    </w:p>
-    <w:p/>
-    <w:p>
-      <w:r>
-        <w:t>When('User enters password {string}', async function (password) {</w:t>
-      </w:r>
-    </w:p>
-    <w:p/>
-    <w:p>
-      <w:r>
-        <w:t xml:space="preserve">await </w:t>
-      </w:r>
-      <w:proofErr w:type="spellStart"/>
-      <w:r>
-        <w:t>this.page.fill</w:t>
-      </w:r>
-      <w:proofErr w:type="spellEnd"/>
-      <w:r>
-        <w:t>("input[name='password']", password);</w:t>
-      </w:r>
-    </w:p>
-    <w:p/>
-    <w:p>
-      <w:r>
-        <w:t>});</w:t>
-      </w:r>
-    </w:p>
-    <w:p/>
-    <w:p>
-      <w:r>
-        <w:t>When('User clicks Login', async function () {</w:t>
-      </w:r>
-    </w:p>
-    <w:p/>
-    <w:p>
-      <w:r>
-        <w:t xml:space="preserve">await </w:t>
-      </w:r>
-      <w:proofErr w:type="spellStart"/>
-      <w:r>
-        <w:t>this.page.click</w:t>
-      </w:r>
-      <w:proofErr w:type="spellEnd"/>
-      <w:r>
-        <w:t>("button[type='submit']");</w:t>
-      </w:r>
-    </w:p>
-    <w:p/>
-    <w:p>
-      <w:r>
-        <w:t>});</w:t>
-      </w:r>
-    </w:p>
-    <w:p/>
-    <w:p>
-      <w:r>
-        <w:t>Then('Dashboard should be displayed', async function () {</w:t>
-      </w:r>
-    </w:p>
-    <w:p/>
-    <w:p>
-      <w:r>
-        <w:t>await expect(</w:t>
-      </w:r>
-      <w:proofErr w:type="spellStart"/>
-      <w:r>
-        <w:t>this.page</w:t>
-      </w:r>
-      <w:proofErr w:type="spellEnd"/>
-      <w:r>
-        <w:t>).</w:t>
-      </w:r>
-      <w:proofErr w:type="spellStart"/>
-      <w:r>
-        <w:t>toHaveURL</w:t>
-      </w:r>
-      <w:proofErr w:type="spellEnd"/>
-      <w:r>
-        <w:t>(/dashboard/);</w:t>
-      </w:r>
-    </w:p>
-    <w:p/>
-    <w:p>
-      <w:r>
-        <w:t>});</w:t>
-      </w:r>
-    </w:p>
-    <w:p>
-      <w:r>
-        <w:pict w14:anchorId="36FF5E7D">
-          <v:rect id="_x0000_i1194" style="width:0;height:1.5pt" o:hralign="center" o:hrstd="t" o:hr="t" fillcolor="#a0a0a0" stroked="f"/>
-        </w:pict>
-      </w:r>
-    </w:p>
-    <w:p>
-      <w:pPr>
-        <w:rPr>
-          <w:b/>
-          <w:bCs/>
-        </w:rPr>
-      </w:pPr>
-      <w:r>
-        <w:rPr>
-          <w:b/>
-          <w:bCs/>
-        </w:rPr>
-        <w:t xml:space="preserve">13. </w:t>
-      </w:r>
-      <w:proofErr w:type="spellStart"/>
-      <w:r>
-        <w:rPr>
-          <w:b/>
-          <w:bCs/>
-        </w:rPr>
-        <w:t>package.json</w:t>
-      </w:r>
-      <w:proofErr w:type="spellEnd"/>
-      <w:r>
-        <w:rPr>
-          <w:b/>
-          <w:bCs/>
-        </w:rPr>
-        <w:t xml:space="preserve"> Scripts</w:t>
-      </w:r>
-    </w:p>
-    <w:p>
-      <w:r>
-        <w:t>"scripts": {</w:t>
-      </w:r>
-    </w:p>
-    <w:p/>
-    <w:p>
-      <w:r>
-        <w:t>"test":"</w:t>
-      </w:r>
-      <w:proofErr w:type="spellStart"/>
-      <w:r>
-        <w:t>cu</w:t>
-      </w:r>
-      <w:proofErr w:type="spellEnd"/>
-      <w:r>
-        <w:t>cumber-js",</w:t>
-      </w:r>
-    </w:p>
-    <w:p/>
-    <w:p>
-      <w:r>
-        <w:t>"smoke":"</w:t>
-      </w:r>
-      <w:proofErr w:type="spellStart"/>
-      <w:r>
-        <w:t>cu</w:t>
-      </w:r>
-      <w:proofErr w:type="spellEnd"/>
-      <w:r>
-        <w:t>cumber-js --tags @Smoke",</w:t>
-      </w:r>
-    </w:p>
-    <w:p/>
-    <w:p>
-      <w:r>
-        <w:t>"regression":"</w:t>
-      </w:r>
-      <w:proofErr w:type="spellStart"/>
-      <w:r>
-        <w:t>cu</w:t>
-      </w:r>
-      <w:proofErr w:type="spellEnd"/>
-      <w:r>
-        <w:t>cumber-js --tags @Regression",</w:t>
-      </w:r>
-    </w:p>
-    <w:p/>
-    <w:p>
-      <w:r>
-        <w:t>"parallel":"</w:t>
-      </w:r>
-      <w:proofErr w:type="spellStart"/>
-      <w:r>
-        <w:t>cu</w:t>
-      </w:r>
-      <w:proofErr w:type="spellEnd"/>
-      <w:r>
-        <w:t>cumber-js --parallel 4"</w:t>
-      </w:r>
-    </w:p>
-    <w:p/>
-    <w:p>
-      <w:r>
-        <w:t>}</w:t>
-      </w:r>
-    </w:p>
-    <w:p>
-      <w:r>
-        <w:pict w14:anchorId="7DD8B88C">
-          <v:rect id="_x0000_i1195" style="width:0;height:1.5pt" o:hralign="center" o:hrstd="t" o:hr="t" fillcolor="#a0a0a0" stroked="f"/>
-        </w:pict>
-      </w:r>
-    </w:p>
-    <w:p>
-      <w:pPr>
-        <w:rPr>
-          <w:b/>
-          <w:bCs/>
-        </w:rPr>
-      </w:pPr>
-      <w:r>
-        <w:rPr>
-          <w:b/>
-          <w:bCs/>
-        </w:rPr>
-        <w:t>14. Running Tests</w:t>
-      </w:r>
-    </w:p>
-    <w:p>
-      <w:r>
-        <w:t>Run all tests</w:t>
-      </w:r>
-    </w:p>
-    <w:p>
-      <w:proofErr w:type="spellStart"/>
-      <w:r>
-        <w:t>npm</w:t>
-      </w:r>
-      <w:proofErr w:type="spellEnd"/>
-      <w:r>
-        <w:t xml:space="preserve"> test</w:t>
-      </w:r>
-    </w:p>
-    <w:p>
-      <w:r>
-        <w:t>or</w:t>
+        <w:t>19. Retry Failed Scenarios</w:t>
       </w:r>
     </w:p>
     <w:p>
@@ -2223,632 +3025,6 @@
         <w:t>js</w:t>
       </w:r>
       <w:proofErr w:type="spellEnd"/>
-    </w:p>
-    <w:p>
-      <w:r>
-        <w:pict w14:anchorId="7E2CDC93">
-          <v:rect id="_x0000_i1196" style="width:0;height:1.5pt" o:hralign="center" o:hrstd="t" o:hr="t" fillcolor="#a0a0a0" stroked="f"/>
-        </w:pict>
-      </w:r>
-    </w:p>
-    <w:p>
-      <w:r>
-        <w:t>Run a feature</w:t>
-      </w:r>
-    </w:p>
-    <w:p>
-      <w:proofErr w:type="spellStart"/>
-      <w:r>
-        <w:t>npx</w:t>
-      </w:r>
-      <w:proofErr w:type="spellEnd"/>
-      <w:r>
-        <w:t xml:space="preserve"> cucumber-</w:t>
-      </w:r>
-      <w:proofErr w:type="spellStart"/>
-      <w:r>
-        <w:t>js</w:t>
-      </w:r>
-      <w:proofErr w:type="spellEnd"/>
-      <w:r>
-        <w:t xml:space="preserve"> features/</w:t>
-      </w:r>
-      <w:proofErr w:type="spellStart"/>
-      <w:r>
-        <w:t>Login.feature</w:t>
-      </w:r>
-      <w:proofErr w:type="spellEnd"/>
-    </w:p>
-    <w:p>
-      <w:r>
-        <w:pict w14:anchorId="1A16EE36">
-          <v:rect id="_x0000_i1197" style="width:0;height:1.5pt" o:hralign="center" o:hrstd="t" o:hr="t" fillcolor="#a0a0a0" stroked="f"/>
-        </w:pict>
-      </w:r>
-    </w:p>
-    <w:p>
-      <w:r>
-        <w:t>Run a scenario using tags</w:t>
-      </w:r>
-    </w:p>
-    <w:p>
-      <w:r>
-        <w:lastRenderedPageBreak/>
-        <w:t>@Smoke</w:t>
-      </w:r>
-    </w:p>
-    <w:p>
-      <w:r>
-        <w:t>Scenario:</w:t>
-      </w:r>
-    </w:p>
-    <w:p>
-      <w:r>
-        <w:t>Execute</w:t>
-      </w:r>
-    </w:p>
-    <w:p>
-      <w:proofErr w:type="spellStart"/>
-      <w:r>
-        <w:rPr>
-          <w:highlight w:val="yellow"/>
-        </w:rPr>
-        <w:t>npx</w:t>
-      </w:r>
-      <w:proofErr w:type="spellEnd"/>
-      <w:r>
-        <w:rPr>
-          <w:highlight w:val="yellow"/>
-        </w:rPr>
-        <w:t xml:space="preserve"> cucumber-</w:t>
-      </w:r>
-      <w:proofErr w:type="spellStart"/>
-      <w:r>
-        <w:rPr>
-          <w:highlight w:val="yellow"/>
-        </w:rPr>
-        <w:t>js</w:t>
-      </w:r>
-      <w:proofErr w:type="spellEnd"/>
-      <w:r>
-        <w:rPr>
-          <w:highlight w:val="yellow"/>
-        </w:rPr>
-        <w:t xml:space="preserve"> --tags "@Smoke"</w:t>
-      </w:r>
-    </w:p>
-    <w:p>
-      <w:r>
-        <w:t>Multiple tags</w:t>
-      </w:r>
-    </w:p>
-    <w:p>
-      <w:proofErr w:type="spellStart"/>
-      <w:r>
-        <w:rPr>
-          <w:highlight w:val="yellow"/>
-        </w:rPr>
-        <w:t>npx</w:t>
-      </w:r>
-      <w:proofErr w:type="spellEnd"/>
-      <w:r>
-        <w:rPr>
-          <w:highlight w:val="yellow"/>
-        </w:rPr>
-        <w:t xml:space="preserve"> cucumber-</w:t>
-      </w:r>
-      <w:proofErr w:type="spellStart"/>
-      <w:r>
-        <w:rPr>
-          <w:highlight w:val="yellow"/>
-        </w:rPr>
-        <w:t>js</w:t>
-      </w:r>
-      <w:proofErr w:type="spellEnd"/>
-      <w:r>
-        <w:rPr>
-          <w:highlight w:val="yellow"/>
-        </w:rPr>
-        <w:t xml:space="preserve"> --tags "@Smoke and not @Regression"</w:t>
-      </w:r>
-    </w:p>
-    <w:p>
-      <w:r>
-        <w:pict w14:anchorId="7CBD5C5D">
-          <v:rect id="_x0000_i1198" style="width:0;height:1.5pt" o:hralign="center" o:hrstd="t" o:hr="t" fillcolor="#a0a0a0" stroked="f"/>
-        </w:pict>
-      </w:r>
-    </w:p>
-    <w:p>
-      <w:pPr>
-        <w:rPr>
-          <w:b/>
-          <w:bCs/>
-        </w:rPr>
-      </w:pPr>
-      <w:r>
-        <w:rPr>
-          <w:b/>
-          <w:bCs/>
-        </w:rPr>
-        <w:t>15. Reports</w:t>
-      </w:r>
-    </w:p>
-    <w:p>
-      <w:r>
-        <w:t>Generate HTML Report</w:t>
-      </w:r>
-    </w:p>
-    <w:p>
-      <w:proofErr w:type="spellStart"/>
-      <w:r>
-        <w:t>npx</w:t>
-      </w:r>
-      <w:proofErr w:type="spellEnd"/>
-      <w:r>
-        <w:t xml:space="preserve"> cucumber-</w:t>
-      </w:r>
-      <w:proofErr w:type="spellStart"/>
-      <w:r>
-        <w:t>js</w:t>
-      </w:r>
-      <w:proofErr w:type="spellEnd"/>
-    </w:p>
-    <w:p>
-      <w:r>
-        <w:t>Output</w:t>
-      </w:r>
-    </w:p>
-    <w:p>
-      <w:r>
-        <w:t>reports</w:t>
-      </w:r>
-    </w:p>
-    <w:p/>
-    <w:p>
-      <w:r>
-        <w:t>cucumber-report.html</w:t>
-      </w:r>
-    </w:p>
-    <w:p/>
-    <w:p>
-      <w:proofErr w:type="spellStart"/>
-      <w:r>
-        <w:t>cucumber.json</w:t>
-      </w:r>
-      <w:proofErr w:type="spellEnd"/>
-    </w:p>
-    <w:p>
-      <w:r>
-        <w:pict w14:anchorId="078D5852">
-          <v:rect id="_x0000_i1199" style="width:0;height:1.5pt" o:hralign="center" o:hrstd="t" o:hr="t" fillcolor="#a0a0a0" stroked="f"/>
-        </w:pict>
-      </w:r>
-    </w:p>
-    <w:p>
-      <w:pPr>
-        <w:rPr>
-          <w:b/>
-          <w:bCs/>
-        </w:rPr>
-      </w:pPr>
-      <w:r>
-        <w:rPr>
-          <w:b/>
-          <w:bCs/>
-        </w:rPr>
-        <w:t>Allure Report</w:t>
-      </w:r>
-    </w:p>
-    <w:p>
-      <w:r>
-        <w:t>Run tests</w:t>
-      </w:r>
-    </w:p>
-    <w:p>
-      <w:proofErr w:type="spellStart"/>
-      <w:r>
-        <w:t>npx</w:t>
-      </w:r>
-      <w:proofErr w:type="spellEnd"/>
-      <w:r>
-        <w:t xml:space="preserve"> cucumber-</w:t>
-      </w:r>
-      <w:proofErr w:type="spellStart"/>
-      <w:r>
-        <w:t>js</w:t>
-      </w:r>
-      <w:proofErr w:type="spellEnd"/>
-    </w:p>
-    <w:p>
-      <w:r>
-        <w:t>Generate report</w:t>
-      </w:r>
-    </w:p>
-    <w:p>
-      <w:r>
-        <w:rPr>
-          <w:highlight w:val="yellow"/>
-        </w:rPr>
-        <w:t>allure generate allure-results --clean</w:t>
-      </w:r>
-    </w:p>
-    <w:p>
-      <w:r>
-        <w:t>Open report</w:t>
-      </w:r>
-    </w:p>
-    <w:p>
-      <w:r>
-        <w:t>allure open</w:t>
-      </w:r>
-    </w:p>
-    <w:p>
-      <w:r>
-        <w:pict w14:anchorId="5481F111">
-          <v:rect id="_x0000_i1200" style="width:0;height:1.5pt" o:hralign="center" o:hrstd="t" o:hr="t" fillcolor="#a0a0a0" stroked="f"/>
-        </w:pict>
-      </w:r>
-    </w:p>
-    <w:p>
-      <w:pPr>
-        <w:rPr>
-          <w:b/>
-          <w:bCs/>
-        </w:rPr>
-      </w:pPr>
-      <w:r>
-        <w:rPr>
-          <w:b/>
-          <w:bCs/>
-        </w:rPr>
-        <w:t>16. Screenshots on Failure</w:t>
-      </w:r>
-    </w:p>
-    <w:p>
-      <w:r>
-        <w:t>Inside After Hook</w:t>
-      </w:r>
-    </w:p>
-    <w:p>
-      <w:r>
-        <w:t>After(async function (scenario){</w:t>
-      </w:r>
-    </w:p>
-    <w:p/>
-    <w:p>
-      <w:r>
-        <w:t>if(</w:t>
-      </w:r>
-      <w:proofErr w:type="spellStart"/>
-      <w:r>
-        <w:t>scenario.</w:t>
-      </w:r>
-      <w:proofErr w:type="gramStart"/>
-      <w:r>
-        <w:t>result?.</w:t>
-      </w:r>
-      <w:proofErr w:type="gramEnd"/>
-      <w:r>
-        <w:t>status</w:t>
-      </w:r>
-      <w:proofErr w:type="spellEnd"/>
-      <w:r>
-        <w:t>==="FAILED"){</w:t>
-      </w:r>
-    </w:p>
-    <w:p/>
-    <w:p>
-      <w:proofErr w:type="spellStart"/>
-      <w:r>
-        <w:t>const</w:t>
-      </w:r>
-      <w:proofErr w:type="spellEnd"/>
-      <w:r>
-        <w:t xml:space="preserve"> image = await </w:t>
-      </w:r>
-      <w:proofErr w:type="spellStart"/>
-      <w:r>
-        <w:t>this.page.screenshot</w:t>
-      </w:r>
-      <w:proofErr w:type="spellEnd"/>
-      <w:r>
-        <w:t>();</w:t>
-      </w:r>
-    </w:p>
-    <w:p/>
-    <w:p>
-      <w:r>
-        <w:t xml:space="preserve">await </w:t>
-      </w:r>
-      <w:proofErr w:type="spellStart"/>
-      <w:r>
-        <w:t>this.attach</w:t>
-      </w:r>
-      <w:proofErr w:type="spellEnd"/>
-      <w:r>
-        <w:t>(</w:t>
-      </w:r>
-      <w:proofErr w:type="spellStart"/>
-      <w:r>
-        <w:t>image,'image</w:t>
-      </w:r>
-      <w:proofErr w:type="spellEnd"/>
-      <w:r>
-        <w:t>/</w:t>
-      </w:r>
-      <w:proofErr w:type="spellStart"/>
-      <w:r>
-        <w:t>png</w:t>
-      </w:r>
-      <w:proofErr w:type="spellEnd"/>
-      <w:r>
-        <w:t>');</w:t>
-      </w:r>
-    </w:p>
-    <w:p/>
-    <w:p>
-      <w:r>
-        <w:t>}</w:t>
-      </w:r>
-    </w:p>
-    <w:p/>
-    <w:p>
-      <w:r>
-        <w:t>});</w:t>
-      </w:r>
-    </w:p>
-    <w:p>
-      <w:r>
-        <w:pict w14:anchorId="180A0A9F">
-          <v:rect id="_x0000_i1201" style="width:0;height:1.5pt" o:hralign="center" o:hrstd="t" o:hr="t" fillcolor="#a0a0a0" stroked="f"/>
-        </w:pict>
-      </w:r>
-    </w:p>
-    <w:p>
-      <w:pPr>
-        <w:rPr>
-          <w:b/>
-          <w:bCs/>
-        </w:rPr>
-      </w:pPr>
-      <w:r>
-        <w:rPr>
-          <w:b/>
-          <w:bCs/>
-        </w:rPr>
-        <w:t>17. Environment Variables</w:t>
-      </w:r>
-    </w:p>
-    <w:p>
-      <w:r>
-        <w:t xml:space="preserve">Install </w:t>
-      </w:r>
-      <w:proofErr w:type="spellStart"/>
-      <w:r>
-        <w:t>dotenv</w:t>
-      </w:r>
-      <w:proofErr w:type="spellEnd"/>
-    </w:p>
-    <w:p>
-      <w:proofErr w:type="spellStart"/>
-      <w:r>
-        <w:t>npm</w:t>
-      </w:r>
-      <w:proofErr w:type="spellEnd"/>
-      <w:r>
-        <w:t xml:space="preserve"> install </w:t>
-      </w:r>
-      <w:proofErr w:type="spellStart"/>
-      <w:r>
-        <w:t>dotenv</w:t>
-      </w:r>
-      <w:proofErr w:type="spellEnd"/>
-    </w:p>
-    <w:p>
-      <w:r>
-        <w:t>.env.qa</w:t>
-      </w:r>
-    </w:p>
-    <w:p>
-      <w:r>
-        <w:t>BASE_URL=https://opensource-demo.orangehrmlive.com</w:t>
-      </w:r>
-    </w:p>
-    <w:p/>
-    <w:p>
-      <w:r>
-        <w:t>USERNAME=Admin</w:t>
-      </w:r>
-    </w:p>
-    <w:p/>
-    <w:p>
-      <w:r>
-        <w:t>PASSWORD=admin123</w:t>
-      </w:r>
-    </w:p>
-    <w:p>
-      <w:proofErr w:type="spellStart"/>
-      <w:r>
-        <w:t>Config.ts</w:t>
-      </w:r>
-      <w:proofErr w:type="spellEnd"/>
-    </w:p>
-    <w:p>
-      <w:r>
-        <w:t xml:space="preserve">import </w:t>
-      </w:r>
-      <w:proofErr w:type="spellStart"/>
-      <w:r>
-        <w:t>dotenv</w:t>
-      </w:r>
-      <w:proofErr w:type="spellEnd"/>
-      <w:r>
-        <w:t xml:space="preserve"> from '</w:t>
-      </w:r>
-      <w:proofErr w:type="spellStart"/>
-      <w:r>
-        <w:t>dotenv</w:t>
-      </w:r>
-      <w:proofErr w:type="spellEnd"/>
-      <w:r>
-        <w:t>';</w:t>
-      </w:r>
-    </w:p>
-    <w:p/>
-    <w:p>
-      <w:proofErr w:type="spellStart"/>
-      <w:r>
-        <w:t>dotenv.config</w:t>
-      </w:r>
-      <w:proofErr w:type="spellEnd"/>
-      <w:r>
-        <w:t>({</w:t>
-      </w:r>
-    </w:p>
-    <w:p/>
-    <w:p>
-      <w:proofErr w:type="spellStart"/>
-      <w:r>
-        <w:t>path:'.env.qa</w:t>
-      </w:r>
-      <w:proofErr w:type="spellEnd"/>
-      <w:r>
-        <w:t>'</w:t>
-      </w:r>
-    </w:p>
-    <w:p/>
-    <w:p>
-      <w:r>
-        <w:t>});</w:t>
-      </w:r>
-    </w:p>
-    <w:p/>
-    <w:p>
-      <w:r>
-        <w:t xml:space="preserve">export </w:t>
-      </w:r>
-      <w:proofErr w:type="spellStart"/>
-      <w:r>
-        <w:t>const</w:t>
-      </w:r>
-      <w:proofErr w:type="spellEnd"/>
-      <w:r>
-        <w:t xml:space="preserve"> Config={</w:t>
-      </w:r>
-    </w:p>
-    <w:p/>
-    <w:p>
-      <w:proofErr w:type="spellStart"/>
-      <w:r>
-        <w:t>baseURL:process.env.BASE_URL</w:t>
-      </w:r>
-      <w:proofErr w:type="spellEnd"/>
-      <w:r>
-        <w:t>,</w:t>
-      </w:r>
-    </w:p>
-    <w:p/>
-    <w:p>
-      <w:proofErr w:type="spellStart"/>
-      <w:r>
-        <w:t>username:process.env.USERNAME</w:t>
-      </w:r>
-      <w:proofErr w:type="spellEnd"/>
-      <w:r>
-        <w:t>,</w:t>
-      </w:r>
-    </w:p>
-    <w:p/>
-    <w:p>
-      <w:proofErr w:type="spellStart"/>
-      <w:r>
-        <w:t>password:process.env.PASSWORD</w:t>
-      </w:r>
-      <w:proofErr w:type="spellEnd"/>
-    </w:p>
-    <w:p/>
-    <w:p>
-      <w:r>
-        <w:t>}</w:t>
-      </w:r>
-    </w:p>
-    <w:p>
-      <w:r>
-        <w:pict w14:anchorId="54462963">
-          <v:rect id="_x0000_i1202" style="width:0;height:1.5pt" o:hralign="center" o:hrstd="t" o:hr="t" fillcolor="#a0a0a0" stroked="f"/>
-        </w:pict>
-      </w:r>
-    </w:p>
-    <w:p>
-      <w:pPr>
-        <w:rPr>
-          <w:b/>
-          <w:bCs/>
-        </w:rPr>
-      </w:pPr>
-      <w:r>
-        <w:rPr>
-          <w:b/>
-          <w:bCs/>
-        </w:rPr>
-        <w:t>18. Parallel Execution</w:t>
-      </w:r>
-    </w:p>
-    <w:p>
-      <w:proofErr w:type="spellStart"/>
-      <w:r>
-        <w:t>npx</w:t>
-      </w:r>
-      <w:proofErr w:type="spellEnd"/>
-      <w:r>
-        <w:t xml:space="preserve"> cucumber-</w:t>
-      </w:r>
-      <w:proofErr w:type="spellStart"/>
-      <w:r>
-        <w:t>js</w:t>
-      </w:r>
-      <w:proofErr w:type="spellEnd"/>
-      <w:r>
-        <w:t xml:space="preserve"> --parallel 4</w:t>
-      </w:r>
-    </w:p>
-    <w:p>
-      <w:r>
-        <w:pict w14:anchorId="22AE9A93">
-          <v:rect id="_x0000_i1203" style="width:0;height:1.5pt" o:hralign="center" o:hrstd="t" o:hr="t" fillcolor="#a0a0a0" stroked="f"/>
-        </w:pict>
-      </w:r>
-    </w:p>
-    <w:p>
-      <w:pPr>
-        <w:rPr>
-          <w:b/>
-          <w:bCs/>
-        </w:rPr>
-      </w:pPr>
-      <w:r>
-        <w:rPr>
-          <w:b/>
-          <w:bCs/>
-        </w:rPr>
-        <w:t>19. Retry Failed Scenarios</w:t>
-      </w:r>
-    </w:p>
-    <w:p>
-      <w:proofErr w:type="spellStart"/>
-      <w:r>
-        <w:t>npx</w:t>
-      </w:r>
-      <w:proofErr w:type="spellEnd"/>
-      <w:r>
-        <w:t xml:space="preserve"> cucumber-</w:t>
-      </w:r>
-      <w:proofErr w:type="spellStart"/>
-      <w:r>
-        <w:t>js</w:t>
-      </w:r>
-      <w:proofErr w:type="spellEnd"/>
       <w:r>
         <w:t xml:space="preserve"> --retry 2</w:t>
       </w:r>
@@ -2856,7 +3032,7 @@
     <w:p>
       <w:r>
         <w:pict w14:anchorId="1F6CCA8D">
-          <v:rect id="_x0000_i1204" style="width:0;height:1.5pt" o:hralign="center" o:hrstd="t" o:hr="t" fillcolor="#a0a0a0" stroked="f"/>
+          <v:rect id="_x0000_i1048" style="width:0;height:1.5pt" o:hralign="center" o:hrstd="t" o:hr="t" fillcolor="#a0a0a0" stroked="f"/>
         </w:pict>
       </w:r>
     </w:p>
@@ -2914,6 +3090,7 @@
                 <w:b/>
                 <w:bCs/>
               </w:rPr>
+              <w:lastRenderedPageBreak/>
               <w:t>Command</w:t>
             </w:r>
           </w:p>
@@ -3163,7 +3340,7 @@
     <w:p>
       <w:r>
         <w:pict w14:anchorId="2BA35233">
-          <v:rect id="_x0000_i1205" style="width:0;height:1.5pt" o:hralign="center" o:hrstd="t" o:hr="t" fillcolor="#a0a0a0" stroked="f"/>
+          <v:rect id="_x0000_i1049" style="width:0;height:1.5pt" o:hralign="center" o:hrstd="t" o:hr="t" fillcolor="#a0a0a0" stroked="f"/>
         </w:pict>
       </w:r>
     </w:p>
@@ -3179,7 +3356,6 @@
           <w:b/>
           <w:bCs/>
         </w:rPr>
-        <w:lastRenderedPageBreak/>
         <w:t>21. Best Practices</w:t>
       </w:r>
     </w:p>
@@ -3315,7 +3491,7 @@
     <w:p>
       <w:r>
         <w:pict w14:anchorId="3395333D">
-          <v:rect id="_x0000_i1206" style="width:0;height:1.5pt" o:hralign="center" o:hrstd="t" o:hr="t" fillcolor="#a0a0a0" stroked="f"/>
+          <v:rect id="_x0000_i1050" style="width:0;height:1.5pt" o:hralign="center" o:hrstd="t" o:hr="t" fillcolor="#a0a0a0" stroked="f"/>
         </w:pict>
       </w:r>
     </w:p>
@@ -3351,6 +3527,7 @@
         <w:rPr>
           <w:rFonts w:ascii="MS Gothic" w:eastAsia="MS Gothic" w:hAnsi="MS Gothic" w:cs="MS Gothic" w:hint="eastAsia"/>
         </w:rPr>
+        <w:lastRenderedPageBreak/>
         <w:t>├</w:t>
       </w:r>
       <w:r>
@@ -3490,7 +3667,6 @@
     </w:p>
     <w:p>
       <w:r>
-        <w:lastRenderedPageBreak/>
         <w:t xml:space="preserve">│      </w:t>
       </w:r>
       <w:proofErr w:type="spellStart"/>

</xml_diff>